<commit_message>
Push with updated file structure and one clean main file
This should now be in the desired folder structure. It should have one main file that runs everything.
</commit_message>
<xml_diff>
--- a/2024 Programs/Program Summary Table.docx
+++ b/2024 Programs/Program Summary Table.docx
@@ -1,17 +1,17 @@
 
 <file path=word/document.xml><?xml version="1.0" encoding="utf-8"?>
-<w:document xmlns:wpc="http://schemas.microsoft.com/office/word/2010/wordprocessingCanvas" xmlns:cx="http://schemas.microsoft.com/office/drawing/2014/chartex" xmlns:cx1="http://schemas.microsoft.com/office/drawing/2015/9/8/chartex" xmlns:cx2="http://schemas.microsoft.com/office/drawing/2015/10/21/chartex" xmlns:cx3="http://schemas.microsoft.com/office/drawing/2016/5/9/chartex" xmlns:cx4="http://schemas.microsoft.com/office/drawing/2016/5/10/chartex" xmlns:cx5="http://schemas.microsoft.com/office/drawing/2016/5/11/chartex" xmlns:cx6="http://schemas.microsoft.com/office/drawing/2016/5/12/chartex" xmlns:cx7="http://schemas.microsoft.com/office/drawing/2016/5/13/chartex" xmlns:cx8="http://schemas.microsoft.com/office/drawing/2016/5/14/chartex" xmlns:mc="http://schemas.openxmlformats.org/markup-compatibility/2006" xmlns:aink="http://schemas.microsoft.com/office/drawing/2016/ink" xmlns:am3d="http://schemas.microsoft.com/office/drawing/2017/model3d" xmlns:o="urn:schemas-microsoft-com:office:office" xmlns:oel="http://schemas.microsoft.com/office/2019/extlst" xmlns:r="http://schemas.openxmlformats.org/officeDocument/2006/relationships" xmlns:m="http://schemas.openxmlformats.org/officeDocument/2006/math" xmlns:v="urn:schemas-microsoft-com:vml" xmlns:wp14="http://schemas.microsoft.com/office/word/2010/wordprocessingDrawing" xmlns:wp="http://schemas.openxmlformats.org/drawingml/2006/wordprocessingDrawing" xmlns:w10="urn:schemas-microsoft-com:office:word" xmlns:w="http://schemas.openxmlformats.org/wordprocessingml/2006/main" xmlns:w14="http://schemas.microsoft.com/office/word/2010/wordml" xmlns:w15="http://schemas.microsoft.com/office/word/2012/wordml" xmlns:w16cex="http://schemas.microsoft.com/office/word/2018/wordml/cex" xmlns:w16cid="http://schemas.microsoft.com/office/word/2016/wordml/cid" xmlns:w16="http://schemas.microsoft.com/office/word/2018/wordml" xmlns:w16du="http://schemas.microsoft.com/office/word/2023/wordml/word16du" xmlns:w16sdtdh="http://schemas.microsoft.com/office/word/2020/wordml/sdtdatahash" xmlns:w16se="http://schemas.microsoft.com/office/word/2015/wordml/symex" xmlns:wpg="http://schemas.microsoft.com/office/word/2010/wordprocessingGroup" xmlns:wpi="http://schemas.microsoft.com/office/word/2010/wordprocessingInk" xmlns:wne="http://schemas.microsoft.com/office/word/2006/wordml" xmlns:wps="http://schemas.microsoft.com/office/word/2010/wordprocessingShape" mc:Ignorable="w14 w15 w16se w16cid w16 w16cex w16sdtdh w16du wp14">
+<w:document xmlns:wpc="http://schemas.microsoft.com/office/word/2010/wordprocessingCanvas" xmlns:cx="http://schemas.microsoft.com/office/drawing/2014/chartex" xmlns:cx1="http://schemas.microsoft.com/office/drawing/2015/9/8/chartex" xmlns:cx2="http://schemas.microsoft.com/office/drawing/2015/10/21/chartex" xmlns:cx3="http://schemas.microsoft.com/office/drawing/2016/5/9/chartex" xmlns:cx4="http://schemas.microsoft.com/office/drawing/2016/5/10/chartex" xmlns:cx5="http://schemas.microsoft.com/office/drawing/2016/5/11/chartex" xmlns:cx6="http://schemas.microsoft.com/office/drawing/2016/5/12/chartex" xmlns:cx7="http://schemas.microsoft.com/office/drawing/2016/5/13/chartex" xmlns:cx8="http://schemas.microsoft.com/office/drawing/2016/5/14/chartex" xmlns:mc="http://schemas.openxmlformats.org/markup-compatibility/2006" xmlns:aink="http://schemas.microsoft.com/office/drawing/2016/ink" xmlns:am3d="http://schemas.microsoft.com/office/drawing/2017/model3d" xmlns:o="urn:schemas-microsoft-com:office:office" xmlns:oel="http://schemas.microsoft.com/office/2019/extlst" xmlns:r="http://schemas.openxmlformats.org/officeDocument/2006/relationships" xmlns:m="http://schemas.openxmlformats.org/officeDocument/2006/math" xmlns:v="urn:schemas-microsoft-com:vml" xmlns:wp14="http://schemas.microsoft.com/office/word/2010/wordprocessingDrawing" xmlns:wp="http://schemas.openxmlformats.org/drawingml/2006/wordprocessingDrawing" xmlns:w10="urn:schemas-microsoft-com:office:word" xmlns:w="http://schemas.openxmlformats.org/wordprocessingml/2006/main" xmlns:w14="http://schemas.microsoft.com/office/word/2010/wordml" xmlns:w15="http://schemas.microsoft.com/office/word/2012/wordml" xmlns:w16cex="http://schemas.microsoft.com/office/word/2018/wordml/cex" xmlns:w16cid="http://schemas.microsoft.com/office/word/2016/wordml/cid" xmlns:w16="http://schemas.microsoft.com/office/word/2018/wordml" xmlns:w16du="http://schemas.microsoft.com/office/word/2023/wordml/word16du" xmlns:w16sdtdh="http://schemas.microsoft.com/office/word/2020/wordml/sdtdatahash" xmlns:w16sdtfl="http://schemas.microsoft.com/office/word/2024/wordml/sdtformatlock" xmlns:w16se="http://schemas.microsoft.com/office/word/2015/wordml/symex" xmlns:wpg="http://schemas.microsoft.com/office/word/2010/wordprocessingGroup" xmlns:wpi="http://schemas.microsoft.com/office/word/2010/wordprocessingInk" xmlns:wne="http://schemas.microsoft.com/office/word/2006/wordml" xmlns:wps="http://schemas.microsoft.com/office/word/2010/wordprocessingShape" mc:Ignorable="w14 w15 w16se w16cid w16 w16cex w16sdtdh w16sdtfl w16du wp14">
   <w:body>
     <w:tbl>
       <w:tblPr>
         <w:tblStyle w:val="TableGrid"/>
-        <w:tblW w:w="11024" w:type="dxa"/>
+        <w:tblW w:w="11305" w:type="dxa"/>
         <w:tblInd w:w="-905" w:type="dxa"/>
         <w:tblLook w:val="04A0" w:firstRow="1" w:lastRow="0" w:firstColumn="1" w:lastColumn="0" w:noHBand="0" w:noVBand="1"/>
       </w:tblPr>
       <w:tblGrid>
         <w:gridCol w:w="2958"/>
-        <w:gridCol w:w="3297"/>
+        <w:gridCol w:w="3578"/>
         <w:gridCol w:w="2765"/>
         <w:gridCol w:w="718"/>
         <w:gridCol w:w="1286"/>
@@ -46,7 +46,7 @@
         </w:tc>
         <w:tc>
           <w:tcPr>
-            <w:tcW w:w="3297" w:type="dxa"/>
+            <w:tcW w:w="3578" w:type="dxa"/>
           </w:tcPr>
           <w:p>
             <w:pPr>
@@ -192,7 +192,7 @@
         </w:tc>
         <w:tc>
           <w:tcPr>
-            <w:tcW w:w="3297" w:type="dxa"/>
+            <w:tcW w:w="3578" w:type="dxa"/>
           </w:tcPr>
           <w:p>
             <w:pPr>
@@ -327,12 +327,13 @@
                 <w:szCs w:val="18"/>
               </w:rPr>
             </w:pPr>
-            <w:r>
-              <w:rPr>
-                <w:sz w:val="18"/>
-                <w:szCs w:val="18"/>
-              </w:rPr>
-              <w:t>ind1990_LCxwalk_annual_</w:t>
+            <w:proofErr w:type="spellStart"/>
+            <w:r>
+              <w:rPr>
+                <w:sz w:val="18"/>
+                <w:szCs w:val="18"/>
+              </w:rPr>
+              <w:t>BLS_Annual_Employment_</w:t>
             </w:r>
             <w:proofErr w:type="gramStart"/>
             <w:r>
@@ -340,7 +341,15 @@
                 <w:sz w:val="18"/>
                 <w:szCs w:val="18"/>
               </w:rPr>
-              <w:t>VN(</w:t>
+              <w:t>VN</w:t>
+            </w:r>
+            <w:proofErr w:type="spellEnd"/>
+            <w:r>
+              <w:rPr>
+                <w:sz w:val="18"/>
+                <w:szCs w:val="18"/>
+              </w:rPr>
+              <w:t>(</w:t>
             </w:r>
             <w:proofErr w:type="gramEnd"/>
             <w:r>
@@ -354,21 +363,35 @@
         </w:tc>
         <w:tc>
           <w:tcPr>
-            <w:tcW w:w="3297" w:type="dxa"/>
-          </w:tcPr>
-          <w:p>
-            <w:pPr>
-              <w:rPr>
-                <w:sz w:val="18"/>
-                <w:szCs w:val="18"/>
-              </w:rPr>
-            </w:pPr>
-            <w:r>
-              <w:rPr>
-                <w:sz w:val="18"/>
-                <w:szCs w:val="18"/>
-              </w:rPr>
-              <w:t>Ind_90_00.xls</w:t>
+            <w:tcW w:w="3578" w:type="dxa"/>
+          </w:tcPr>
+          <w:p>
+            <w:pPr>
+              <w:rPr>
+                <w:sz w:val="18"/>
+                <w:szCs w:val="18"/>
+              </w:rPr>
+            </w:pPr>
+            <w:r>
+              <w:rPr>
+                <w:sz w:val="18"/>
+                <w:szCs w:val="18"/>
+              </w:rPr>
+              <w:t>Employmentbysector79-2023.xlsx</w:t>
+            </w:r>
+            <w:r>
+              <w:rPr>
+                <w:sz w:val="18"/>
+                <w:szCs w:val="18"/>
+              </w:rPr>
+              <w:t xml:space="preserve">, </w:t>
+            </w:r>
+            <w:r>
+              <w:rPr>
+                <w:sz w:val="18"/>
+                <w:szCs w:val="18"/>
+              </w:rPr>
+              <w:t>ce.industry.txt</w:t>
             </w:r>
           </w:p>
         </w:tc>
@@ -383,13 +406,15 @@
                 <w:szCs w:val="18"/>
               </w:rPr>
             </w:pPr>
-            <w:r>
-              <w:rPr>
-                <w:sz w:val="18"/>
-                <w:szCs w:val="18"/>
-              </w:rPr>
-              <w:t>ind1990LCxwalk_annual</w:t>
-            </w:r>
+            <w:proofErr w:type="spellStart"/>
+            <w:r>
+              <w:rPr>
+                <w:sz w:val="18"/>
+                <w:szCs w:val="18"/>
+              </w:rPr>
+              <w:t>emp_gdp_inf_annual</w:t>
+            </w:r>
+            <w:proofErr w:type="spellEnd"/>
           </w:p>
         </w:tc>
         <w:tc>
@@ -408,7 +433,7 @@
                 <w:sz w:val="18"/>
                 <w:szCs w:val="18"/>
               </w:rPr>
-              <w:t>No</w:t>
+              <w:t>Yes</w:t>
             </w:r>
           </w:p>
         </w:tc>
@@ -428,7 +453,7 @@
                 <w:sz w:val="18"/>
                 <w:szCs w:val="18"/>
               </w:rPr>
-              <w:t>Categorizes Ind1990 variable into Line Codes which are used across BLS/BEA data</w:t>
+              <w:t>Imports employment from BLS and merges with inflation and GDP data</w:t>
             </w:r>
           </w:p>
         </w:tc>
@@ -454,7 +479,7 @@
                 <w:sz w:val="18"/>
                 <w:szCs w:val="18"/>
               </w:rPr>
-              <w:t>BLS_Annual_Employment_</w:t>
+              <w:t>collapses_cps_annual_</w:t>
             </w:r>
             <w:proofErr w:type="gramStart"/>
             <w:r>
@@ -484,36 +509,24 @@
         </w:tc>
         <w:tc>
           <w:tcPr>
-            <w:tcW w:w="3297" w:type="dxa"/>
-          </w:tcPr>
-          <w:p>
-            <w:pPr>
-              <w:rPr>
-                <w:sz w:val="18"/>
-                <w:szCs w:val="18"/>
-              </w:rPr>
-            </w:pPr>
-            <w:r>
-              <w:rPr>
-                <w:sz w:val="18"/>
-                <w:szCs w:val="18"/>
-              </w:rPr>
-              <w:t>Employmentbysector79-2023.xlsx</w:t>
-            </w:r>
-            <w:r>
-              <w:rPr>
-                <w:sz w:val="18"/>
-                <w:szCs w:val="18"/>
-              </w:rPr>
-              <w:t xml:space="preserve">, </w:t>
-            </w:r>
-            <w:r>
-              <w:rPr>
-                <w:sz w:val="18"/>
-                <w:szCs w:val="18"/>
-              </w:rPr>
-              <w:t>ce.industry.txt</w:t>
-            </w:r>
+            <w:tcW w:w="3578" w:type="dxa"/>
+          </w:tcPr>
+          <w:p>
+            <w:pPr>
+              <w:rPr>
+                <w:sz w:val="18"/>
+                <w:szCs w:val="18"/>
+              </w:rPr>
+            </w:pPr>
+            <w:proofErr w:type="spellStart"/>
+            <w:r>
+              <w:rPr>
+                <w:sz w:val="18"/>
+                <w:szCs w:val="18"/>
+              </w:rPr>
+              <w:t>fullcps</w:t>
+            </w:r>
+            <w:proofErr w:type="spellEnd"/>
           </w:p>
         </w:tc>
         <w:tc>
@@ -533,9 +546,141 @@
                 <w:sz w:val="18"/>
                 <w:szCs w:val="18"/>
               </w:rPr>
-              <w:t>emp_gdp_inf_annual</w:t>
+              <w:t>merged_cps</w:t>
             </w:r>
             <w:proofErr w:type="spellEnd"/>
+            <w:proofErr w:type="gramStart"/>
+            <w:r>
+              <w:rPr>
+                <w:sz w:val="18"/>
+                <w:szCs w:val="18"/>
+              </w:rPr>
+              <w:t>_(</w:t>
+            </w:r>
+            <w:proofErr w:type="gramEnd"/>
+            <w:r>
+              <w:rPr>
+                <w:sz w:val="18"/>
+                <w:szCs w:val="18"/>
+              </w:rPr>
+              <w:t xml:space="preserve">year range), </w:t>
+            </w:r>
+            <w:proofErr w:type="spellStart"/>
+            <w:r>
+              <w:rPr>
+                <w:sz w:val="18"/>
+                <w:szCs w:val="18"/>
+              </w:rPr>
+              <w:t>wagechanges</w:t>
+            </w:r>
+            <w:proofErr w:type="spellEnd"/>
+            <w:proofErr w:type="gramStart"/>
+            <w:r>
+              <w:rPr>
+                <w:sz w:val="18"/>
+                <w:szCs w:val="18"/>
+              </w:rPr>
+              <w:t>_(</w:t>
+            </w:r>
+            <w:proofErr w:type="gramEnd"/>
+            <w:r>
+              <w:rPr>
+                <w:sz w:val="18"/>
+                <w:szCs w:val="18"/>
+              </w:rPr>
+              <w:t>year range), separations</w:t>
+            </w:r>
+            <w:proofErr w:type="gramStart"/>
+            <w:r>
+              <w:rPr>
+                <w:sz w:val="18"/>
+                <w:szCs w:val="18"/>
+              </w:rPr>
+              <w:t>_(</w:t>
+            </w:r>
+            <w:proofErr w:type="gramEnd"/>
+            <w:r>
+              <w:rPr>
+                <w:sz w:val="18"/>
+                <w:szCs w:val="18"/>
+              </w:rPr>
+              <w:t xml:space="preserve">year range), </w:t>
+            </w:r>
+            <w:proofErr w:type="spellStart"/>
+            <w:r>
+              <w:rPr>
+                <w:sz w:val="18"/>
+                <w:szCs w:val="18"/>
+              </w:rPr>
+              <w:t>collapsed_wages_i</w:t>
+            </w:r>
+            <w:proofErr w:type="spellEnd"/>
+            <w:proofErr w:type="gramStart"/>
+            <w:r>
+              <w:rPr>
+                <w:sz w:val="18"/>
+                <w:szCs w:val="18"/>
+              </w:rPr>
+              <w:t>_(</w:t>
+            </w:r>
+            <w:proofErr w:type="gramEnd"/>
+            <w:r>
+              <w:rPr>
+                <w:sz w:val="18"/>
+                <w:szCs w:val="18"/>
+              </w:rPr>
+              <w:t xml:space="preserve">year range), </w:t>
+            </w:r>
+            <w:proofErr w:type="spellStart"/>
+            <w:r>
+              <w:rPr>
+                <w:sz w:val="18"/>
+                <w:szCs w:val="18"/>
+              </w:rPr>
+              <w:t>collapsed_hours</w:t>
+            </w:r>
+            <w:proofErr w:type="spellEnd"/>
+            <w:proofErr w:type="gramStart"/>
+            <w:r>
+              <w:rPr>
+                <w:sz w:val="18"/>
+                <w:szCs w:val="18"/>
+              </w:rPr>
+              <w:t>_(</w:t>
+            </w:r>
+            <w:proofErr w:type="gramEnd"/>
+            <w:r>
+              <w:rPr>
+                <w:sz w:val="18"/>
+                <w:szCs w:val="18"/>
+              </w:rPr>
+              <w:t xml:space="preserve">year range), </w:t>
+            </w:r>
+            <w:proofErr w:type="spellStart"/>
+            <w:r>
+              <w:rPr>
+                <w:sz w:val="18"/>
+                <w:szCs w:val="18"/>
+              </w:rPr>
+              <w:t>collapsed_demographics_i</w:t>
+            </w:r>
+            <w:proofErr w:type="spellEnd"/>
+            <w:proofErr w:type="gramStart"/>
+            <w:r>
+              <w:rPr>
+                <w:sz w:val="18"/>
+                <w:szCs w:val="18"/>
+              </w:rPr>
+              <w:t>_(</w:t>
+            </w:r>
+            <w:proofErr w:type="gramEnd"/>
+            <w:r>
+              <w:rPr>
+                <w:sz w:val="18"/>
+                <w:szCs w:val="18"/>
+              </w:rPr>
+              <w:t>year range)</w:t>
+            </w:r>
           </w:p>
         </w:tc>
         <w:tc>
@@ -574,7 +719,7 @@
                 <w:sz w:val="18"/>
                 <w:szCs w:val="18"/>
               </w:rPr>
-              <w:t>Imports employment from BLS and merges with inflation and GDP data</w:t>
+              <w:t>Merges wage, demographic, separations, hours, and sector level data for 1979-1992, 1993-2004, 2005-2023</w:t>
             </w:r>
           </w:p>
         </w:tc>
@@ -600,21 +745,7 @@
                 <w:sz w:val="18"/>
                 <w:szCs w:val="18"/>
               </w:rPr>
-              <w:t>c</w:t>
-            </w:r>
-            <w:r>
-              <w:rPr>
-                <w:sz w:val="18"/>
-                <w:szCs w:val="18"/>
-              </w:rPr>
-              <w:t>ollapses_cps_annual</w:t>
-            </w:r>
-            <w:r>
-              <w:rPr>
-                <w:sz w:val="18"/>
-                <w:szCs w:val="18"/>
-              </w:rPr>
-              <w:t>_</w:t>
+              <w:t>Execute_Macro_Regression_</w:t>
             </w:r>
             <w:proofErr w:type="gramStart"/>
             <w:r>
@@ -644,7 +775,7 @@
         </w:tc>
         <w:tc>
           <w:tcPr>
-            <w:tcW w:w="3297" w:type="dxa"/>
+            <w:tcW w:w="3578" w:type="dxa"/>
           </w:tcPr>
           <w:p>
             <w:pPr>
@@ -654,21 +785,90 @@
               </w:rPr>
             </w:pPr>
             <w:proofErr w:type="spellStart"/>
+            <w:r>
+              <w:rPr>
+                <w:sz w:val="18"/>
+                <w:szCs w:val="18"/>
+              </w:rPr>
+              <w:t>merged_cps_annual</w:t>
+            </w:r>
+            <w:proofErr w:type="spellEnd"/>
+            <w:r>
+              <w:rPr>
+                <w:sz w:val="18"/>
+                <w:szCs w:val="18"/>
+              </w:rPr>
+              <w:t>/</w:t>
+            </w:r>
+            <w:proofErr w:type="spellStart"/>
+            <w:r>
+              <w:rPr>
+                <w:sz w:val="18"/>
+                <w:szCs w:val="18"/>
+              </w:rPr>
+              <w:t>merged_cps_quarterly</w:t>
+            </w:r>
+            <w:proofErr w:type="spellEnd"/>
+          </w:p>
+        </w:tc>
+        <w:tc>
+          <w:tcPr>
+            <w:tcW w:w="2765" w:type="dxa"/>
+          </w:tcPr>
+          <w:p>
+            <w:pPr>
+              <w:rPr>
+                <w:sz w:val="18"/>
+                <w:szCs w:val="18"/>
+              </w:rPr>
+            </w:pPr>
+          </w:p>
+        </w:tc>
+        <w:tc>
+          <w:tcPr>
+            <w:tcW w:w="718" w:type="dxa"/>
+          </w:tcPr>
+          <w:p>
+            <w:pPr>
+              <w:rPr>
+                <w:sz w:val="18"/>
+                <w:szCs w:val="18"/>
+              </w:rPr>
+            </w:pPr>
+            <w:r>
+              <w:rPr>
+                <w:sz w:val="18"/>
+                <w:szCs w:val="18"/>
+              </w:rPr>
+              <w:t>No</w:t>
+            </w:r>
+          </w:p>
+        </w:tc>
+        <w:tc>
+          <w:tcPr>
+            <w:tcW w:w="1286" w:type="dxa"/>
+          </w:tcPr>
+          <w:p>
+            <w:pPr>
+              <w:rPr>
+                <w:sz w:val="18"/>
+                <w:szCs w:val="18"/>
+              </w:rPr>
+            </w:pPr>
+            <w:r>
+              <w:rPr>
+                <w:sz w:val="18"/>
+                <w:szCs w:val="18"/>
+              </w:rPr>
+              <w:t xml:space="preserve">Appends the merged and collapsed cps data for the </w:t>
+            </w:r>
             <w:proofErr w:type="gramStart"/>
             <w:r>
               <w:rPr>
                 <w:sz w:val="18"/>
                 <w:szCs w:val="18"/>
               </w:rPr>
-              <w:t>fullcps</w:t>
-            </w:r>
-            <w:proofErr w:type="spellEnd"/>
-            <w:r>
-              <w:rPr>
-                <w:sz w:val="18"/>
-                <w:szCs w:val="18"/>
-              </w:rPr>
-              <w:t>(</w:t>
+              <w:t>3 year</w:t>
             </w:r>
             <w:proofErr w:type="gramEnd"/>
             <w:r>
@@ -676,149 +876,7 @@
                 <w:sz w:val="18"/>
                 <w:szCs w:val="18"/>
               </w:rPr>
-              <w:t>year range)mincer</w:t>
-            </w:r>
-          </w:p>
-        </w:tc>
-        <w:tc>
-          <w:tcPr>
-            <w:tcW w:w="2765" w:type="dxa"/>
-          </w:tcPr>
-          <w:p>
-            <w:pPr>
-              <w:rPr>
-                <w:sz w:val="18"/>
-                <w:szCs w:val="18"/>
-              </w:rPr>
-            </w:pPr>
-            <w:proofErr w:type="spellStart"/>
-            <w:r>
-              <w:rPr>
-                <w:sz w:val="18"/>
-                <w:szCs w:val="18"/>
-              </w:rPr>
-              <w:t>merged_cps</w:t>
-            </w:r>
-            <w:proofErr w:type="spellEnd"/>
-            <w:proofErr w:type="gramStart"/>
-            <w:r>
-              <w:rPr>
-                <w:sz w:val="18"/>
-                <w:szCs w:val="18"/>
-              </w:rPr>
-              <w:t>_(</w:t>
-            </w:r>
-            <w:proofErr w:type="gramEnd"/>
-            <w:r>
-              <w:rPr>
-                <w:sz w:val="18"/>
-                <w:szCs w:val="18"/>
-              </w:rPr>
-              <w:t xml:space="preserve">year range), </w:t>
-            </w:r>
-            <w:proofErr w:type="spellStart"/>
-            <w:r>
-              <w:rPr>
-                <w:sz w:val="18"/>
-                <w:szCs w:val="18"/>
-              </w:rPr>
-              <w:t>wagechanges</w:t>
-            </w:r>
-            <w:proofErr w:type="spellEnd"/>
-            <w:r>
-              <w:rPr>
-                <w:sz w:val="18"/>
-                <w:szCs w:val="18"/>
-              </w:rPr>
-              <w:t xml:space="preserve">_(year range), separations_(year range), </w:t>
-            </w:r>
-            <w:proofErr w:type="spellStart"/>
-            <w:r>
-              <w:rPr>
-                <w:sz w:val="18"/>
-                <w:szCs w:val="18"/>
-              </w:rPr>
-              <w:t>collapsed_wages_i</w:t>
-            </w:r>
-            <w:proofErr w:type="spellEnd"/>
-            <w:r>
-              <w:rPr>
-                <w:sz w:val="18"/>
-                <w:szCs w:val="18"/>
-              </w:rPr>
-              <w:t xml:space="preserve">_(year range), </w:t>
-            </w:r>
-            <w:proofErr w:type="spellStart"/>
-            <w:r>
-              <w:rPr>
-                <w:sz w:val="18"/>
-                <w:szCs w:val="18"/>
-              </w:rPr>
-              <w:t>collapsed_hours</w:t>
-            </w:r>
-            <w:proofErr w:type="spellEnd"/>
-            <w:r>
-              <w:rPr>
-                <w:sz w:val="18"/>
-                <w:szCs w:val="18"/>
-              </w:rPr>
-              <w:t xml:space="preserve">_(year range), </w:t>
-            </w:r>
-            <w:proofErr w:type="spellStart"/>
-            <w:r>
-              <w:rPr>
-                <w:sz w:val="18"/>
-                <w:szCs w:val="18"/>
-              </w:rPr>
-              <w:t>collapsed_demographics_i</w:t>
-            </w:r>
-            <w:proofErr w:type="spellEnd"/>
-            <w:r>
-              <w:rPr>
-                <w:sz w:val="18"/>
-                <w:szCs w:val="18"/>
-              </w:rPr>
-              <w:t>_(year range)</w:t>
-            </w:r>
-          </w:p>
-        </w:tc>
-        <w:tc>
-          <w:tcPr>
-            <w:tcW w:w="718" w:type="dxa"/>
-          </w:tcPr>
-          <w:p>
-            <w:pPr>
-              <w:rPr>
-                <w:sz w:val="18"/>
-                <w:szCs w:val="18"/>
-              </w:rPr>
-            </w:pPr>
-            <w:r>
-              <w:rPr>
-                <w:sz w:val="18"/>
-                <w:szCs w:val="18"/>
-              </w:rPr>
-              <w:t>Yes</w:t>
-            </w:r>
-          </w:p>
-        </w:tc>
-        <w:tc>
-          <w:tcPr>
-            <w:tcW w:w="1286" w:type="dxa"/>
-          </w:tcPr>
-          <w:p>
-            <w:pPr>
-              <w:rPr>
-                <w:sz w:val="18"/>
-                <w:szCs w:val="18"/>
-              </w:rPr>
-            </w:pPr>
-            <w:r>
-              <w:rPr>
-                <w:sz w:val="18"/>
-                <w:szCs w:val="18"/>
-              </w:rPr>
-              <w:t>Merges wage, demographic, separations, hours, and sector level data for 1979-1992, 1993-2004, 2005-2023</w:t>
+              <w:t xml:space="preserve"> bands and then runs the macro regression</w:t>
             </w:r>
           </w:p>
         </w:tc>
@@ -844,52 +902,31 @@
                 <w:sz w:val="18"/>
                 <w:szCs w:val="18"/>
               </w:rPr>
-              <w:t>Execute_Macro_Regression_</w:t>
-            </w:r>
-            <w:proofErr w:type="gramStart"/>
-            <w:r>
-              <w:rPr>
-                <w:sz w:val="18"/>
-                <w:szCs w:val="18"/>
-              </w:rPr>
-              <w:t>VN</w:t>
+              <w:t>Execute_Micro_Regression</w:t>
             </w:r>
             <w:proofErr w:type="spellEnd"/>
-            <w:r>
-              <w:rPr>
-                <w:sz w:val="18"/>
-                <w:szCs w:val="18"/>
-              </w:rPr>
-              <w:t>(</w:t>
-            </w:r>
-            <w:proofErr w:type="gramEnd"/>
-            <w:r>
-              <w:rPr>
-                <w:sz w:val="18"/>
-                <w:szCs w:val="18"/>
-              </w:rPr>
-              <w:t>24)</w:t>
-            </w:r>
-          </w:p>
-        </w:tc>
-        <w:tc>
-          <w:tcPr>
-            <w:tcW w:w="3297" w:type="dxa"/>
-          </w:tcPr>
-          <w:p>
-            <w:pPr>
-              <w:rPr>
-                <w:sz w:val="18"/>
-                <w:szCs w:val="18"/>
-              </w:rPr>
-            </w:pPr>
-            <w:r>
-              <w:rPr>
-                <w:sz w:val="18"/>
-                <w:szCs w:val="18"/>
-              </w:rPr>
-              <w:t>merged_cps_0523, merged_cps_9304, merged_cps_7992</w:t>
-            </w:r>
+          </w:p>
+        </w:tc>
+        <w:tc>
+          <w:tcPr>
+            <w:tcW w:w="3578" w:type="dxa"/>
+          </w:tcPr>
+          <w:p>
+            <w:pPr>
+              <w:rPr>
+                <w:sz w:val="18"/>
+                <w:szCs w:val="18"/>
+              </w:rPr>
+            </w:pPr>
+            <w:proofErr w:type="spellStart"/>
+            <w:r>
+              <w:rPr>
+                <w:sz w:val="18"/>
+                <w:szCs w:val="18"/>
+              </w:rPr>
+              <w:t>fullcps</w:t>
+            </w:r>
+            <w:proofErr w:type="spellEnd"/>
           </w:p>
         </w:tc>
         <w:tc>
@@ -909,7 +946,7 @@
                 <w:sz w:val="18"/>
                 <w:szCs w:val="18"/>
               </w:rPr>
-              <w:t>merged_cps_annual</w:t>
+              <w:t>fullcps_microreg</w:t>
             </w:r>
             <w:proofErr w:type="spellEnd"/>
           </w:p>
@@ -930,7 +967,7 @@
                 <w:sz w:val="18"/>
                 <w:szCs w:val="18"/>
               </w:rPr>
-              <w:t>No</w:t>
+              <w:t>Yes</w:t>
             </w:r>
           </w:p>
         </w:tc>
@@ -950,23 +987,23 @@
                 <w:sz w:val="18"/>
                 <w:szCs w:val="18"/>
               </w:rPr>
-              <w:t xml:space="preserve">Appends the merged and collapsed cps data for the </w:t>
-            </w:r>
-            <w:proofErr w:type="gramStart"/>
-            <w:r>
-              <w:rPr>
-                <w:sz w:val="18"/>
-                <w:szCs w:val="18"/>
-              </w:rPr>
-              <w:t>3 year</w:t>
-            </w:r>
-            <w:proofErr w:type="gramEnd"/>
-            <w:r>
-              <w:rPr>
-                <w:sz w:val="18"/>
-                <w:szCs w:val="18"/>
-              </w:rPr>
-              <w:t xml:space="preserve"> bands and then runs the macro regression</w:t>
+              <w:t xml:space="preserve">Appends various mincer residual </w:t>
+            </w:r>
+            <w:proofErr w:type="spellStart"/>
+            <w:r>
+              <w:rPr>
+                <w:sz w:val="18"/>
+                <w:szCs w:val="18"/>
+              </w:rPr>
+              <w:t>dta</w:t>
+            </w:r>
+            <w:proofErr w:type="spellEnd"/>
+            <w:r>
+              <w:rPr>
+                <w:sz w:val="18"/>
+                <w:szCs w:val="18"/>
+              </w:rPr>
+              <w:t xml:space="preserve"> files and creates controls for micro regression</w:t>
             </w:r>
           </w:p>
         </w:tc>
@@ -992,28 +1029,51 @@
                 <w:sz w:val="18"/>
                 <w:szCs w:val="18"/>
               </w:rPr>
-              <w:t>Execute_Micro_Regression</w:t>
+              <w:t>Imputewages_</w:t>
+            </w:r>
+            <w:proofErr w:type="gramStart"/>
+            <w:r>
+              <w:rPr>
+                <w:sz w:val="18"/>
+                <w:szCs w:val="18"/>
+              </w:rPr>
+              <w:t>VN</w:t>
             </w:r>
             <w:proofErr w:type="spellEnd"/>
-          </w:p>
-        </w:tc>
-        <w:tc>
-          <w:tcPr>
-            <w:tcW w:w="3297" w:type="dxa"/>
-          </w:tcPr>
-          <w:p>
-            <w:pPr>
-              <w:rPr>
-                <w:sz w:val="18"/>
-                <w:szCs w:val="18"/>
-              </w:rPr>
-            </w:pPr>
-            <w:r>
-              <w:rPr>
-                <w:sz w:val="18"/>
-                <w:szCs w:val="18"/>
-              </w:rPr>
-              <w:t>fullcps0523mincer, fullcps9304mincer, fullcps7992</w:t>
+            <w:r>
+              <w:rPr>
+                <w:sz w:val="18"/>
+                <w:szCs w:val="18"/>
+              </w:rPr>
+              <w:t>(</w:t>
+            </w:r>
+            <w:proofErr w:type="gramEnd"/>
+            <w:r>
+              <w:rPr>
+                <w:sz w:val="18"/>
+                <w:szCs w:val="18"/>
+              </w:rPr>
+              <w:t>24)</w:t>
+            </w:r>
+          </w:p>
+        </w:tc>
+        <w:tc>
+          <w:tcPr>
+            <w:tcW w:w="3578" w:type="dxa"/>
+          </w:tcPr>
+          <w:p>
+            <w:pPr>
+              <w:rPr>
+                <w:sz w:val="18"/>
+                <w:szCs w:val="18"/>
+              </w:rPr>
+            </w:pPr>
+            <w:r>
+              <w:rPr>
+                <w:sz w:val="18"/>
+                <w:szCs w:val="18"/>
+              </w:rPr>
+              <w:t>fullcps0523, fullcps9304, fullcps7992</w:t>
             </w:r>
           </w:p>
         </w:tc>
@@ -1034,7 +1094,7 @@
                 <w:sz w:val="18"/>
                 <w:szCs w:val="18"/>
               </w:rPr>
-              <w:t>fullcps_microreg</w:t>
+              <w:t>fullcps</w:t>
             </w:r>
             <w:proofErr w:type="spellEnd"/>
           </w:p>
@@ -1075,23 +1135,7 @@
                 <w:sz w:val="18"/>
                 <w:szCs w:val="18"/>
               </w:rPr>
-              <w:t xml:space="preserve">Appends various mincer residual </w:t>
-            </w:r>
-            <w:proofErr w:type="spellStart"/>
-            <w:r>
-              <w:rPr>
-                <w:sz w:val="18"/>
-                <w:szCs w:val="18"/>
-              </w:rPr>
-              <w:t>dta</w:t>
-            </w:r>
-            <w:proofErr w:type="spellEnd"/>
-            <w:r>
-              <w:rPr>
-                <w:sz w:val="18"/>
-                <w:szCs w:val="18"/>
-              </w:rPr>
-              <w:t xml:space="preserve"> files and creates controls for micro regression</w:t>
+              <w:t xml:space="preserve">Use distribution to impute the top code for different year ranges </w:t>
             </w:r>
           </w:p>
         </w:tc>
@@ -1117,7 +1161,7 @@
                 <w:sz w:val="18"/>
                 <w:szCs w:val="18"/>
               </w:rPr>
-              <w:t>Imputewages_</w:t>
+              <w:t>Microdataprep_</w:t>
             </w:r>
             <w:proofErr w:type="gramStart"/>
             <w:r>
@@ -1147,7 +1191,7 @@
         </w:tc>
         <w:tc>
           <w:tcPr>
-            <w:tcW w:w="3297" w:type="dxa"/>
+            <w:tcW w:w="3578" w:type="dxa"/>
           </w:tcPr>
           <w:p>
             <w:pPr>
@@ -1201,7 +1245,7 @@
                 <w:sz w:val="18"/>
                 <w:szCs w:val="18"/>
               </w:rPr>
-              <w:t>Yes</w:t>
+              <w:t>No</w:t>
             </w:r>
           </w:p>
         </w:tc>
@@ -1221,14 +1265,7 @@
                 <w:sz w:val="18"/>
                 <w:szCs w:val="18"/>
               </w:rPr>
-              <w:t xml:space="preserve">Use distribution to impute the top code </w:t>
-            </w:r>
-            <w:r>
-              <w:rPr>
-                <w:sz w:val="18"/>
-                <w:szCs w:val="18"/>
-              </w:rPr>
-              <w:t xml:space="preserve">for different year ranges </w:t>
+              <w:t>Create controls for mincer equation</w:t>
             </w:r>
           </w:p>
         </w:tc>
@@ -1254,7 +1291,49 @@
                 <w:sz w:val="18"/>
                 <w:szCs w:val="18"/>
               </w:rPr>
-              <w:t>Microdataprep_</w:t>
+              <w:t>BuildI</w:t>
+            </w:r>
+            <w:r>
+              <w:rPr>
+                <w:sz w:val="18"/>
+                <w:szCs w:val="18"/>
+              </w:rPr>
+              <w:t>nflation</w:t>
+            </w:r>
+            <w:r>
+              <w:rPr>
+                <w:sz w:val="18"/>
+                <w:szCs w:val="18"/>
+              </w:rPr>
+              <w:t>Index</w:t>
+            </w:r>
+            <w:proofErr w:type="spellEnd"/>
+          </w:p>
+        </w:tc>
+        <w:tc>
+          <w:tcPr>
+            <w:tcW w:w="3578" w:type="dxa"/>
+          </w:tcPr>
+          <w:p>
+            <w:pPr>
+              <w:rPr>
+                <w:sz w:val="18"/>
+                <w:szCs w:val="18"/>
+              </w:rPr>
+            </w:pPr>
+            <w:r>
+              <w:rPr>
+                <w:sz w:val="18"/>
+                <w:szCs w:val="18"/>
+              </w:rPr>
+              <w:t>GDPbyInd_VA_1947-1997.xlsx</w:t>
+            </w:r>
+            <w:r>
+              <w:rPr>
+                <w:sz w:val="18"/>
+                <w:szCs w:val="18"/>
+              </w:rPr>
+              <w:t xml:space="preserve">, </w:t>
             </w:r>
             <w:proofErr w:type="gramStart"/>
             <w:r>
@@ -1262,7 +1341,36 @@
                 <w:sz w:val="18"/>
                 <w:szCs w:val="18"/>
               </w:rPr>
-              <w:t>VN</w:t>
+              <w:t>PriceIndices(</w:t>
+            </w:r>
+            <w:proofErr w:type="gramEnd"/>
+            <w:r>
+              <w:rPr>
+                <w:sz w:val="18"/>
+                <w:szCs w:val="18"/>
+              </w:rPr>
+              <w:t>97-23).xlsx</w:t>
+            </w:r>
+          </w:p>
+        </w:tc>
+        <w:tc>
+          <w:tcPr>
+            <w:tcW w:w="2765" w:type="dxa"/>
+          </w:tcPr>
+          <w:p>
+            <w:pPr>
+              <w:rPr>
+                <w:sz w:val="18"/>
+                <w:szCs w:val="18"/>
+              </w:rPr>
+            </w:pPr>
+            <w:proofErr w:type="spellStart"/>
+            <w:r>
+              <w:rPr>
+                <w:sz w:val="18"/>
+                <w:szCs w:val="18"/>
+              </w:rPr>
+              <w:t>AnnualInflation_final</w:t>
             </w:r>
             <w:proofErr w:type="spellEnd"/>
             <w:r>
@@ -1270,55 +1378,7 @@
                 <w:sz w:val="18"/>
                 <w:szCs w:val="18"/>
               </w:rPr>
-              <w:t>(</w:t>
-            </w:r>
-            <w:proofErr w:type="gramEnd"/>
-            <w:r>
-              <w:rPr>
-                <w:sz w:val="18"/>
-                <w:szCs w:val="18"/>
-              </w:rPr>
-              <w:t>24)</w:t>
-            </w:r>
-          </w:p>
-        </w:tc>
-        <w:tc>
-          <w:tcPr>
-            <w:tcW w:w="3297" w:type="dxa"/>
-          </w:tcPr>
-          <w:p>
-            <w:pPr>
-              <w:rPr>
-                <w:sz w:val="18"/>
-                <w:szCs w:val="18"/>
-              </w:rPr>
-            </w:pPr>
-            <w:r>
-              <w:rPr>
-                <w:sz w:val="18"/>
-                <w:szCs w:val="18"/>
-              </w:rPr>
-              <w:t>fullcps0523, fullcps9304, fullcps7992</w:t>
-            </w:r>
-          </w:p>
-        </w:tc>
-        <w:tc>
-          <w:tcPr>
-            <w:tcW w:w="2765" w:type="dxa"/>
-          </w:tcPr>
-          <w:p>
-            <w:pPr>
-              <w:rPr>
-                <w:sz w:val="18"/>
-                <w:szCs w:val="18"/>
-              </w:rPr>
-            </w:pPr>
-            <w:r>
-              <w:rPr>
-                <w:sz w:val="18"/>
-                <w:szCs w:val="18"/>
-              </w:rPr>
-              <w:t>fullcps0523, fullcps9304, fullcps7992</w:t>
+              <w:t>, annual_inflation_gdp</w:t>
             </w:r>
           </w:p>
         </w:tc>
@@ -1358,14 +1418,7 @@
                 <w:sz w:val="18"/>
                 <w:szCs w:val="18"/>
               </w:rPr>
-              <w:t xml:space="preserve">Create controls for </w:t>
-            </w:r>
-            <w:r>
-              <w:rPr>
-                <w:sz w:val="18"/>
-                <w:szCs w:val="18"/>
-              </w:rPr>
-              <w:t>mincer equation</w:t>
+              <w:t>Creates price index from two spreadsheets for inflation rate by industry</w:t>
             </w:r>
           </w:p>
         </w:tc>
@@ -1385,28 +1438,13 @@
                 <w:szCs w:val="18"/>
               </w:rPr>
             </w:pPr>
-            <w:proofErr w:type="spellStart"/>
             <w:r>
               <w:rPr>
                 <w:sz w:val="18"/>
                 <w:szCs w:val="18"/>
               </w:rPr>
               <w:lastRenderedPageBreak/>
-              <w:t>LoadAnnual</w:t>
-            </w:r>
-            <w:r>
-              <w:rPr>
-                <w:sz w:val="18"/>
-                <w:szCs w:val="18"/>
-              </w:rPr>
-              <w:t>Inflation</w:t>
-            </w:r>
-            <w:r>
-              <w:rPr>
-                <w:sz w:val="18"/>
-                <w:szCs w:val="18"/>
-              </w:rPr>
-              <w:t>_</w:t>
+              <w:t>Creatingfullcps05_</w:t>
             </w:r>
             <w:proofErr w:type="gramStart"/>
             <w:r>
@@ -1414,15 +1452,7 @@
                 <w:sz w:val="18"/>
                 <w:szCs w:val="18"/>
               </w:rPr>
-              <w:t>VN</w:t>
-            </w:r>
-            <w:proofErr w:type="spellEnd"/>
-            <w:r>
-              <w:rPr>
-                <w:sz w:val="18"/>
-                <w:szCs w:val="18"/>
-              </w:rPr>
-              <w:t>(</w:t>
+              <w:t>VN(</w:t>
             </w:r>
             <w:proofErr w:type="gramEnd"/>
             <w:r>
@@ -1436,44 +1466,21 @@
         </w:tc>
         <w:tc>
           <w:tcPr>
-            <w:tcW w:w="3297" w:type="dxa"/>
-          </w:tcPr>
-          <w:p>
-            <w:pPr>
-              <w:rPr>
-                <w:sz w:val="18"/>
-                <w:szCs w:val="18"/>
-              </w:rPr>
-            </w:pPr>
-            <w:r>
-              <w:rPr>
-                <w:sz w:val="18"/>
-                <w:szCs w:val="18"/>
-              </w:rPr>
-              <w:t>GDPbyInd_VA_1947-1997.xlsx</w:t>
-            </w:r>
-            <w:r>
-              <w:rPr>
-                <w:sz w:val="18"/>
-                <w:szCs w:val="18"/>
-              </w:rPr>
-              <w:t xml:space="preserve">, </w:t>
-            </w:r>
-            <w:proofErr w:type="gramStart"/>
-            <w:r>
-              <w:rPr>
-                <w:sz w:val="18"/>
-                <w:szCs w:val="18"/>
-              </w:rPr>
-              <w:t>PriceIndices(</w:t>
-            </w:r>
-            <w:proofErr w:type="gramEnd"/>
-            <w:r>
-              <w:rPr>
-                <w:sz w:val="18"/>
-                <w:szCs w:val="18"/>
-              </w:rPr>
-              <w:t>97-23).xlsx</w:t>
+            <w:tcW w:w="3578" w:type="dxa"/>
+          </w:tcPr>
+          <w:p>
+            <w:pPr>
+              <w:rPr>
+                <w:sz w:val="18"/>
+                <w:szCs w:val="18"/>
+              </w:rPr>
+            </w:pPr>
+            <w:r>
+              <w:rPr>
+                <w:sz w:val="18"/>
+                <w:szCs w:val="18"/>
+              </w:rPr>
+              <w:t xml:space="preserve">cps_00041, cps_00040, cps_00042, </w:t>
             </w:r>
           </w:p>
         </w:tc>
@@ -1488,15 +1495,13 @@
                 <w:szCs w:val="18"/>
               </w:rPr>
             </w:pPr>
-            <w:proofErr w:type="spellStart"/>
-            <w:r>
-              <w:rPr>
-                <w:sz w:val="18"/>
-                <w:szCs w:val="18"/>
-              </w:rPr>
-              <w:t>AnnualInflation_final</w:t>
-            </w:r>
-            <w:proofErr w:type="spellEnd"/>
+            <w:r>
+              <w:rPr>
+                <w:sz w:val="18"/>
+                <w:szCs w:val="18"/>
+              </w:rPr>
+              <w:t>fullcps0523</w:t>
+            </w:r>
           </w:p>
         </w:tc>
         <w:tc>
@@ -1515,7 +1520,7 @@
                 <w:sz w:val="18"/>
                 <w:szCs w:val="18"/>
               </w:rPr>
-              <w:t>No</w:t>
+              <w:t>Yes</w:t>
             </w:r>
           </w:p>
         </w:tc>
@@ -1535,7 +1540,7 @@
                 <w:sz w:val="18"/>
                 <w:szCs w:val="18"/>
               </w:rPr>
-              <w:t>Creates price index from two spreadsheets for inflation rate by industry</w:t>
+              <w:t>Creates microdata file for 2005-2023 and for quarterly regression</w:t>
             </w:r>
           </w:p>
         </w:tc>
@@ -1560,7 +1565,7 @@
                 <w:sz w:val="18"/>
                 <w:szCs w:val="18"/>
               </w:rPr>
-              <w:t>Creatingfullcps05_</w:t>
+              <w:t>ind1990_LCxwalk_</w:t>
             </w:r>
             <w:proofErr w:type="gramStart"/>
             <w:r>
@@ -1582,21 +1587,28 @@
         </w:tc>
         <w:tc>
           <w:tcPr>
-            <w:tcW w:w="3297" w:type="dxa"/>
-          </w:tcPr>
-          <w:p>
-            <w:pPr>
-              <w:rPr>
-                <w:sz w:val="18"/>
-                <w:szCs w:val="18"/>
-              </w:rPr>
-            </w:pPr>
-            <w:r>
-              <w:rPr>
-                <w:sz w:val="18"/>
-                <w:szCs w:val="18"/>
-              </w:rPr>
-              <w:t xml:space="preserve">cps_00041, cps_00040, cps_00042, </w:t>
+            <w:tcW w:w="3578" w:type="dxa"/>
+          </w:tcPr>
+          <w:p>
+            <w:pPr>
+              <w:rPr>
+                <w:sz w:val="18"/>
+                <w:szCs w:val="18"/>
+              </w:rPr>
+            </w:pPr>
+            <w:r>
+              <w:rPr>
+                <w:sz w:val="18"/>
+                <w:szCs w:val="18"/>
+              </w:rPr>
+              <w:t>ind_90-00.xl</w:t>
+            </w:r>
+            <w:r>
+              <w:rPr>
+                <w:sz w:val="18"/>
+                <w:szCs w:val="18"/>
+              </w:rPr>
+              <w:t>s</w:t>
             </w:r>
           </w:p>
         </w:tc>
@@ -1616,7 +1628,7 @@
                 <w:sz w:val="18"/>
                 <w:szCs w:val="18"/>
               </w:rPr>
-              <w:t>fullcps0523</w:t>
+              <w:t>ind1990LCxwalk</w:t>
             </w:r>
           </w:p>
         </w:tc>
@@ -1656,14 +1668,7 @@
                 <w:sz w:val="18"/>
                 <w:szCs w:val="18"/>
               </w:rPr>
-              <w:t xml:space="preserve">Creates microdata file for 2005-2023 and </w:t>
-            </w:r>
-            <w:r>
-              <w:rPr>
-                <w:sz w:val="18"/>
-                <w:szCs w:val="18"/>
-              </w:rPr>
-              <w:t>for quarterly regression</w:t>
+              <w:t>Matches ind1990 to industry categories</w:t>
             </w:r>
           </w:p>
         </w:tc>
@@ -1688,50 +1693,27 @@
                 <w:sz w:val="18"/>
                 <w:szCs w:val="18"/>
               </w:rPr>
-              <w:t>ind1990_LCxwalk_</w:t>
-            </w:r>
-            <w:proofErr w:type="gramStart"/>
-            <w:r>
-              <w:rPr>
-                <w:sz w:val="18"/>
-                <w:szCs w:val="18"/>
-              </w:rPr>
-              <w:t>VN(</w:t>
-            </w:r>
-            <w:proofErr w:type="gramEnd"/>
-            <w:r>
-              <w:rPr>
-                <w:sz w:val="18"/>
-                <w:szCs w:val="18"/>
-              </w:rPr>
-              <w:t>24)</w:t>
-            </w:r>
-          </w:p>
-        </w:tc>
-        <w:tc>
-          <w:tcPr>
-            <w:tcW w:w="3297" w:type="dxa"/>
-          </w:tcPr>
-          <w:p>
-            <w:pPr>
-              <w:rPr>
-                <w:sz w:val="18"/>
-                <w:szCs w:val="18"/>
-              </w:rPr>
-            </w:pPr>
-            <w:r>
-              <w:rPr>
-                <w:sz w:val="18"/>
-                <w:szCs w:val="18"/>
-              </w:rPr>
-              <w:t>ind_90-00.xl</w:t>
-            </w:r>
-            <w:r>
-              <w:rPr>
-                <w:sz w:val="18"/>
-                <w:szCs w:val="18"/>
-              </w:rPr>
-              <w:t>s</w:t>
+              <w:t>fullcpsbuilder_9304</w:t>
+            </w:r>
+          </w:p>
+        </w:tc>
+        <w:tc>
+          <w:tcPr>
+            <w:tcW w:w="3578" w:type="dxa"/>
+          </w:tcPr>
+          <w:p>
+            <w:pPr>
+              <w:rPr>
+                <w:sz w:val="18"/>
+                <w:szCs w:val="18"/>
+              </w:rPr>
+            </w:pPr>
+            <w:r>
+              <w:rPr>
+                <w:sz w:val="18"/>
+                <w:szCs w:val="18"/>
+              </w:rPr>
+              <w:t>cps_00039, cps_00040, cps_00044</w:t>
             </w:r>
           </w:p>
         </w:tc>
@@ -1751,7 +1733,7 @@
                 <w:sz w:val="18"/>
                 <w:szCs w:val="18"/>
               </w:rPr>
-              <w:t>ind1990LCxwalk</w:t>
+              <w:t>fullcps9304</w:t>
             </w:r>
           </w:p>
         </w:tc>
@@ -1791,7 +1773,23 @@
                 <w:sz w:val="18"/>
                 <w:szCs w:val="18"/>
               </w:rPr>
-              <w:t>Matches ind1990 to industry categories</w:t>
+              <w:t xml:space="preserve">Appends and creates </w:t>
+            </w:r>
+            <w:proofErr w:type="spellStart"/>
+            <w:r>
+              <w:rPr>
+                <w:sz w:val="18"/>
+                <w:szCs w:val="18"/>
+              </w:rPr>
+              <w:t>microdataset</w:t>
+            </w:r>
+            <w:proofErr w:type="spellEnd"/>
+            <w:r>
+              <w:rPr>
+                <w:sz w:val="18"/>
+                <w:szCs w:val="18"/>
+              </w:rPr>
+              <w:t xml:space="preserve"> for 1993-2004 and merged with Line Codes</w:t>
             </w:r>
           </w:p>
         </w:tc>
@@ -1816,27 +1814,43 @@
                 <w:sz w:val="18"/>
                 <w:szCs w:val="18"/>
               </w:rPr>
-              <w:t>fullcpsbuilder_9304</w:t>
-            </w:r>
-          </w:p>
-        </w:tc>
-        <w:tc>
-          <w:tcPr>
-            <w:tcW w:w="3297" w:type="dxa"/>
-          </w:tcPr>
-          <w:p>
-            <w:pPr>
-              <w:rPr>
-                <w:sz w:val="18"/>
-                <w:szCs w:val="18"/>
-              </w:rPr>
-            </w:pPr>
-            <w:r>
-              <w:rPr>
-                <w:sz w:val="18"/>
-                <w:szCs w:val="18"/>
-              </w:rPr>
-              <w:t>cps_00039, cps_00040, cps_00044</w:t>
+              <w:t>fullcpsbuilder7992_</w:t>
+            </w:r>
+            <w:proofErr w:type="gramStart"/>
+            <w:r>
+              <w:rPr>
+                <w:sz w:val="18"/>
+                <w:szCs w:val="18"/>
+              </w:rPr>
+              <w:t>VN(</w:t>
+            </w:r>
+            <w:proofErr w:type="gramEnd"/>
+            <w:r>
+              <w:rPr>
+                <w:sz w:val="18"/>
+                <w:szCs w:val="18"/>
+              </w:rPr>
+              <w:t>24)</w:t>
+            </w:r>
+          </w:p>
+        </w:tc>
+        <w:tc>
+          <w:tcPr>
+            <w:tcW w:w="3578" w:type="dxa"/>
+          </w:tcPr>
+          <w:p>
+            <w:pPr>
+              <w:rPr>
+                <w:sz w:val="18"/>
+                <w:szCs w:val="18"/>
+              </w:rPr>
+            </w:pPr>
+            <w:r>
+              <w:rPr>
+                <w:sz w:val="18"/>
+                <w:szCs w:val="18"/>
+              </w:rPr>
+              <w:t>cps_00039, cps_00038, cps_00044, cps_00046, 79morgearnings, 8081morgearnings</w:t>
             </w:r>
           </w:p>
         </w:tc>
@@ -1856,7 +1870,7 @@
                 <w:sz w:val="18"/>
                 <w:szCs w:val="18"/>
               </w:rPr>
-              <w:t>fullcps9304</w:t>
+              <w:t>fullcps7992</w:t>
             </w:r>
           </w:p>
         </w:tc>
@@ -1912,7 +1926,7 @@
                 <w:sz w:val="18"/>
                 <w:szCs w:val="18"/>
               </w:rPr>
-              <w:t xml:space="preserve"> for 1993-2004 and merged with Line Codes</w:t>
+              <w:t xml:space="preserve"> for 1993-2004 and merged with Line Codes and MORG data</w:t>
             </w:r>
           </w:p>
         </w:tc>
@@ -1932,12 +1946,13 @@
                 <w:szCs w:val="18"/>
               </w:rPr>
             </w:pPr>
-            <w:r>
-              <w:rPr>
-                <w:sz w:val="18"/>
-                <w:szCs w:val="18"/>
-              </w:rPr>
-              <w:t>fullcpsbuilder7992_</w:t>
+            <w:proofErr w:type="spellStart"/>
+            <w:r>
+              <w:rPr>
+                <w:sz w:val="18"/>
+                <w:szCs w:val="18"/>
+              </w:rPr>
+              <w:t>Merges_MORG_</w:t>
             </w:r>
             <w:proofErr w:type="gramStart"/>
             <w:r>
@@ -1945,7 +1960,15 @@
                 <w:sz w:val="18"/>
                 <w:szCs w:val="18"/>
               </w:rPr>
-              <w:t>VN(</w:t>
+              <w:t>VN</w:t>
+            </w:r>
+            <w:proofErr w:type="spellEnd"/>
+            <w:r>
+              <w:rPr>
+                <w:sz w:val="18"/>
+                <w:szCs w:val="18"/>
+              </w:rPr>
+              <w:t>(</w:t>
             </w:r>
             <w:proofErr w:type="gramEnd"/>
             <w:r>
@@ -1959,42 +1982,28 @@
         </w:tc>
         <w:tc>
           <w:tcPr>
-            <w:tcW w:w="3297" w:type="dxa"/>
-          </w:tcPr>
-          <w:p>
-            <w:pPr>
-              <w:rPr>
-                <w:sz w:val="18"/>
-                <w:szCs w:val="18"/>
-              </w:rPr>
-            </w:pPr>
-            <w:r>
-              <w:rPr>
-                <w:sz w:val="18"/>
-                <w:szCs w:val="18"/>
-              </w:rPr>
-              <w:t>cps_00039, cps_000</w:t>
-            </w:r>
-            <w:r>
-              <w:rPr>
-                <w:sz w:val="18"/>
-                <w:szCs w:val="18"/>
-              </w:rPr>
-              <w:t>38</w:t>
-            </w:r>
-            <w:r>
-              <w:rPr>
-                <w:sz w:val="18"/>
-                <w:szCs w:val="18"/>
-              </w:rPr>
-              <w:t>, cps_00044</w:t>
-            </w:r>
-            <w:r>
-              <w:rPr>
-                <w:sz w:val="18"/>
-                <w:szCs w:val="18"/>
-              </w:rPr>
-              <w:t>, cps_00046, 79morgearnings, 8081morgearnings</w:t>
+            <w:tcW w:w="3578" w:type="dxa"/>
+          </w:tcPr>
+          <w:p>
+            <w:pPr>
+              <w:rPr>
+                <w:sz w:val="18"/>
+                <w:szCs w:val="18"/>
+              </w:rPr>
+            </w:pPr>
+            <w:r>
+              <w:rPr>
+                <w:sz w:val="18"/>
+                <w:szCs w:val="18"/>
+              </w:rPr>
+              <w:t>earnings_1979_1981</w:t>
+            </w:r>
+            <w:r>
+              <w:rPr>
+                <w:sz w:val="18"/>
+                <w:szCs w:val="18"/>
+              </w:rPr>
+              <w:t>, cps_00043, cps_00038</w:t>
             </w:r>
           </w:p>
         </w:tc>
@@ -2014,7 +2023,21 @@
                 <w:sz w:val="18"/>
                 <w:szCs w:val="18"/>
               </w:rPr>
-              <w:t>fullcps7992</w:t>
+              <w:t>79morgearnings</w:t>
+            </w:r>
+            <w:r>
+              <w:rPr>
+                <w:sz w:val="18"/>
+                <w:szCs w:val="18"/>
+              </w:rPr>
+              <w:t xml:space="preserve">, </w:t>
+            </w:r>
+            <w:r>
+              <w:rPr>
+                <w:sz w:val="18"/>
+                <w:szCs w:val="18"/>
+              </w:rPr>
+              <w:t>8081morgearnings</w:t>
             </w:r>
           </w:p>
         </w:tc>
@@ -2054,30 +2077,7 @@
                 <w:sz w:val="18"/>
                 <w:szCs w:val="18"/>
               </w:rPr>
-              <w:t xml:space="preserve">Appends and creates </w:t>
-            </w:r>
-            <w:proofErr w:type="spellStart"/>
-            <w:r>
-              <w:rPr>
-                <w:sz w:val="18"/>
-                <w:szCs w:val="18"/>
-              </w:rPr>
-              <w:t>microdataset</w:t>
-            </w:r>
-            <w:proofErr w:type="spellEnd"/>
-            <w:r>
-              <w:rPr>
-                <w:sz w:val="18"/>
-                <w:szCs w:val="18"/>
-              </w:rPr>
-              <w:t xml:space="preserve"> for 1993-2004 and merged with Line Codes</w:t>
-            </w:r>
-            <w:r>
-              <w:rPr>
-                <w:sz w:val="18"/>
-                <w:szCs w:val="18"/>
-              </w:rPr>
-              <w:t xml:space="preserve"> and MORG data</w:t>
+              <w:t>Take the cps files and merge them with the MORG files to replace earnings and hours</w:t>
             </w:r>
           </w:p>
         </w:tc>
@@ -2097,120 +2097,78 @@
                 <w:szCs w:val="18"/>
               </w:rPr>
             </w:pPr>
+            <w:r>
+              <w:rPr>
+                <w:sz w:val="18"/>
+                <w:szCs w:val="18"/>
+              </w:rPr>
+              <w:t>ParsesSeriesID_</w:t>
+            </w:r>
+            <w:proofErr w:type="gramStart"/>
+            <w:r>
+              <w:rPr>
+                <w:sz w:val="18"/>
+                <w:szCs w:val="18"/>
+              </w:rPr>
+              <w:t>VN(</w:t>
+            </w:r>
+            <w:proofErr w:type="gramEnd"/>
+            <w:r>
+              <w:rPr>
+                <w:sz w:val="18"/>
+                <w:szCs w:val="18"/>
+              </w:rPr>
+              <w:t>24)</w:t>
+            </w:r>
+          </w:p>
+        </w:tc>
+        <w:tc>
+          <w:tcPr>
+            <w:tcW w:w="3578" w:type="dxa"/>
+          </w:tcPr>
+          <w:p>
+            <w:pPr>
+              <w:rPr>
+                <w:sz w:val="18"/>
+                <w:szCs w:val="18"/>
+              </w:rPr>
+            </w:pPr>
+            <w:r>
+              <w:rPr>
+                <w:sz w:val="18"/>
+                <w:szCs w:val="18"/>
+              </w:rPr>
+              <w:t>MasterSeries.xlsx</w:t>
+            </w:r>
+            <w:r>
+              <w:rPr>
+                <w:sz w:val="18"/>
+                <w:szCs w:val="18"/>
+              </w:rPr>
+              <w:t xml:space="preserve"> </w:t>
+            </w:r>
+          </w:p>
+        </w:tc>
+        <w:tc>
+          <w:tcPr>
+            <w:tcW w:w="2765" w:type="dxa"/>
+          </w:tcPr>
+          <w:p>
+            <w:pPr>
+              <w:rPr>
+                <w:sz w:val="18"/>
+                <w:szCs w:val="18"/>
+              </w:rPr>
+            </w:pPr>
             <w:proofErr w:type="spellStart"/>
             <w:r>
               <w:rPr>
                 <w:sz w:val="18"/>
                 <w:szCs w:val="18"/>
               </w:rPr>
-              <w:t>Merges_MORG_</w:t>
-            </w:r>
-            <w:proofErr w:type="gramStart"/>
-            <w:r>
-              <w:rPr>
-                <w:sz w:val="18"/>
-                <w:szCs w:val="18"/>
-              </w:rPr>
-              <w:t>VN</w:t>
+              <w:t>employeesgdpmerged</w:t>
             </w:r>
             <w:proofErr w:type="spellEnd"/>
-            <w:r>
-              <w:rPr>
-                <w:sz w:val="18"/>
-                <w:szCs w:val="18"/>
-              </w:rPr>
-              <w:t>(</w:t>
-            </w:r>
-            <w:proofErr w:type="gramEnd"/>
-            <w:r>
-              <w:rPr>
-                <w:sz w:val="18"/>
-                <w:szCs w:val="18"/>
-              </w:rPr>
-              <w:t>24)</w:t>
-            </w:r>
-          </w:p>
-        </w:tc>
-        <w:tc>
-          <w:tcPr>
-            <w:tcW w:w="3297" w:type="dxa"/>
-          </w:tcPr>
-          <w:p>
-            <w:pPr>
-              <w:rPr>
-                <w:sz w:val="18"/>
-                <w:szCs w:val="18"/>
-              </w:rPr>
-            </w:pPr>
-            <w:r>
-              <w:rPr>
-                <w:sz w:val="18"/>
-                <w:szCs w:val="18"/>
-              </w:rPr>
-              <w:t>earnings_1979_1981</w:t>
-            </w:r>
-            <w:r>
-              <w:rPr>
-                <w:sz w:val="18"/>
-                <w:szCs w:val="18"/>
-              </w:rPr>
-              <w:t>, cps_</w:t>
-            </w:r>
-            <w:r>
-              <w:rPr>
-                <w:sz w:val="18"/>
-                <w:szCs w:val="18"/>
-              </w:rPr>
-              <w:t>000</w:t>
-            </w:r>
-            <w:r>
-              <w:rPr>
-                <w:sz w:val="18"/>
-                <w:szCs w:val="18"/>
-              </w:rPr>
-              <w:t xml:space="preserve">43, </w:t>
-            </w:r>
-            <w:r>
-              <w:rPr>
-                <w:sz w:val="18"/>
-                <w:szCs w:val="18"/>
-              </w:rPr>
-              <w:t>cps_00038</w:t>
-            </w:r>
-          </w:p>
-        </w:tc>
-        <w:tc>
-          <w:tcPr>
-            <w:tcW w:w="2765" w:type="dxa"/>
-          </w:tcPr>
-          <w:p>
-            <w:pPr>
-              <w:rPr>
-                <w:sz w:val="18"/>
-                <w:szCs w:val="18"/>
-              </w:rPr>
-            </w:pPr>
-            <w:r>
-              <w:rPr>
-                <w:sz w:val="18"/>
-                <w:szCs w:val="18"/>
-              </w:rPr>
-              <w:t>79morgearnings</w:t>
-            </w:r>
-            <w:r>
-              <w:rPr>
-                <w:sz w:val="18"/>
-                <w:szCs w:val="18"/>
-              </w:rPr>
-              <w:t xml:space="preserve">, </w:t>
-            </w:r>
-            <w:r>
-              <w:rPr>
-                <w:sz w:val="18"/>
-                <w:szCs w:val="18"/>
-              </w:rPr>
-              <w:t>8081morgearnings</w:t>
-            </w:r>
           </w:p>
         </w:tc>
         <w:tc>
@@ -2249,7 +2207,7 @@
                 <w:sz w:val="18"/>
                 <w:szCs w:val="18"/>
               </w:rPr>
-              <w:t>Take the cps files and merge them with the MORG files to replace earnings and hours</w:t>
+              <w:t xml:space="preserve">Creates employment by state-sector and then merges with quarterly inflation and GDP data </w:t>
             </w:r>
           </w:p>
         </w:tc>
@@ -2275,7 +2233,7 @@
                 <w:sz w:val="18"/>
                 <w:szCs w:val="18"/>
               </w:rPr>
-              <w:t>ParsesSeriesID_</w:t>
+              <w:t>collapsescps_quarterly_</w:t>
             </w:r>
             <w:proofErr w:type="gramStart"/>
             <w:r>
@@ -2305,29 +2263,40 @@
         </w:tc>
         <w:tc>
           <w:tcPr>
-            <w:tcW w:w="3297" w:type="dxa"/>
-          </w:tcPr>
-          <w:p>
-            <w:pPr>
-              <w:rPr>
-                <w:sz w:val="18"/>
-                <w:szCs w:val="18"/>
-              </w:rPr>
-            </w:pPr>
-            <w:r>
-              <w:rPr>
-                <w:sz w:val="18"/>
-                <w:szCs w:val="18"/>
-              </w:rPr>
-              <w:t>MasterSeries.xlsx</w:t>
-            </w:r>
-            <w:r>
-              <w:rPr>
-                <w:sz w:val="18"/>
-                <w:szCs w:val="18"/>
-              </w:rPr>
-              <w:t xml:space="preserve"> </w:t>
-            </w:r>
+            <w:tcW w:w="3578" w:type="dxa"/>
+          </w:tcPr>
+          <w:p>
+            <w:pPr>
+              <w:rPr>
+                <w:sz w:val="18"/>
+                <w:szCs w:val="18"/>
+              </w:rPr>
+            </w:pPr>
+            <w:proofErr w:type="spellStart"/>
+            <w:r>
+              <w:rPr>
+                <w:sz w:val="18"/>
+                <w:szCs w:val="18"/>
+              </w:rPr>
+              <w:t>fullcps</w:t>
+            </w:r>
+            <w:proofErr w:type="spellEnd"/>
+            <w:r>
+              <w:rPr>
+                <w:sz w:val="18"/>
+                <w:szCs w:val="18"/>
+              </w:rPr>
+              <w:t xml:space="preserve">, </w:t>
+            </w:r>
+            <w:proofErr w:type="spellStart"/>
+            <w:r>
+              <w:rPr>
+                <w:sz w:val="18"/>
+                <w:szCs w:val="18"/>
+              </w:rPr>
+              <w:t>employeesgdpmerged</w:t>
+            </w:r>
+            <w:proofErr w:type="spellEnd"/>
           </w:p>
         </w:tc>
         <w:tc>
@@ -2341,15 +2310,86 @@
                 <w:szCs w:val="18"/>
               </w:rPr>
             </w:pPr>
+            <w:r>
+              <w:rPr>
+                <w:sz w:val="18"/>
+                <w:szCs w:val="18"/>
+              </w:rPr>
+              <w:t xml:space="preserve">fullcps_0523, </w:t>
+            </w:r>
             <w:proofErr w:type="spellStart"/>
             <w:r>
               <w:rPr>
                 <w:sz w:val="18"/>
                 <w:szCs w:val="18"/>
               </w:rPr>
-              <w:t>employeesgdpmerged</w:t>
+              <w:t>separations_q</w:t>
             </w:r>
             <w:proofErr w:type="spellEnd"/>
+            <w:r>
+              <w:rPr>
+                <w:sz w:val="18"/>
+                <w:szCs w:val="18"/>
+              </w:rPr>
+              <w:t xml:space="preserve">, </w:t>
+            </w:r>
+            <w:proofErr w:type="spellStart"/>
+            <w:r>
+              <w:rPr>
+                <w:sz w:val="18"/>
+                <w:szCs w:val="18"/>
+              </w:rPr>
+              <w:t>wagechanges_q</w:t>
+            </w:r>
+            <w:proofErr w:type="spellEnd"/>
+            <w:r>
+              <w:rPr>
+                <w:sz w:val="18"/>
+                <w:szCs w:val="18"/>
+              </w:rPr>
+              <w:t xml:space="preserve">, </w:t>
+            </w:r>
+            <w:proofErr w:type="spellStart"/>
+            <w:r>
+              <w:rPr>
+                <w:sz w:val="18"/>
+                <w:szCs w:val="18"/>
+              </w:rPr>
+              <w:t>collapsed_demographics_q</w:t>
+            </w:r>
+            <w:proofErr w:type="spellEnd"/>
+            <w:r>
+              <w:rPr>
+                <w:sz w:val="18"/>
+                <w:szCs w:val="18"/>
+              </w:rPr>
+              <w:t xml:space="preserve">, </w:t>
+            </w:r>
+            <w:proofErr w:type="spellStart"/>
+            <w:r>
+              <w:rPr>
+                <w:sz w:val="18"/>
+                <w:szCs w:val="18"/>
+              </w:rPr>
+              <w:t>collapsedwages_q</w:t>
+            </w:r>
+            <w:proofErr w:type="spellEnd"/>
+            <w:r>
+              <w:rPr>
+                <w:sz w:val="18"/>
+                <w:szCs w:val="18"/>
+              </w:rPr>
+              <w:t xml:space="preserve">, </w:t>
+            </w:r>
+            <w:proofErr w:type="spellStart"/>
+            <w:r>
+              <w:rPr>
+                <w:sz w:val="18"/>
+                <w:szCs w:val="18"/>
+              </w:rPr>
+              <w:t>collapsedhours_q</w:t>
+            </w:r>
+            <w:proofErr w:type="spellEnd"/>
           </w:p>
         </w:tc>
         <w:tc>
@@ -2388,7 +2428,7 @@
                 <w:sz w:val="18"/>
                 <w:szCs w:val="18"/>
               </w:rPr>
-              <w:t xml:space="preserve">Creates employment by state-sector and then merges with quarterly inflation and GDP data </w:t>
+              <w:t>Uses microdata to collapse necessary variables by State, industry, and year-quarter and merges with macro data</w:t>
             </w:r>
           </w:p>
         </w:tc>
@@ -2414,14 +2454,7 @@
                 <w:sz w:val="18"/>
                 <w:szCs w:val="18"/>
               </w:rPr>
-              <w:t>collapsescps</w:t>
-            </w:r>
-            <w:r>
-              <w:rPr>
-                <w:sz w:val="18"/>
-                <w:szCs w:val="18"/>
-              </w:rPr>
-              <w:t>_</w:t>
+              <w:t>MincerEquation_</w:t>
             </w:r>
             <w:proofErr w:type="gramStart"/>
             <w:r>
@@ -2451,21 +2484,89 @@
         </w:tc>
         <w:tc>
           <w:tcPr>
-            <w:tcW w:w="3297" w:type="dxa"/>
-          </w:tcPr>
-          <w:p>
-            <w:pPr>
-              <w:rPr>
-                <w:sz w:val="18"/>
-                <w:szCs w:val="18"/>
-              </w:rPr>
-            </w:pPr>
-            <w:r>
-              <w:rPr>
-                <w:sz w:val="18"/>
-                <w:szCs w:val="18"/>
-              </w:rPr>
-              <w:t xml:space="preserve">fullcps0523, </w:t>
+            <w:tcW w:w="3578" w:type="dxa"/>
+          </w:tcPr>
+          <w:p>
+            <w:pPr>
+              <w:rPr>
+                <w:sz w:val="18"/>
+                <w:szCs w:val="18"/>
+              </w:rPr>
+            </w:pPr>
+            <w:r>
+              <w:rPr>
+                <w:sz w:val="18"/>
+                <w:szCs w:val="18"/>
+              </w:rPr>
+              <w:t>fullcps0523, fullcps7992, fullcps9304</w:t>
+            </w:r>
+          </w:p>
+        </w:tc>
+        <w:tc>
+          <w:tcPr>
+            <w:tcW w:w="2765" w:type="dxa"/>
+          </w:tcPr>
+          <w:p>
+            <w:pPr>
+              <w:rPr>
+                <w:sz w:val="18"/>
+                <w:szCs w:val="18"/>
+              </w:rPr>
+            </w:pPr>
+            <w:r>
+              <w:rPr>
+                <w:sz w:val="18"/>
+                <w:szCs w:val="18"/>
+              </w:rPr>
+              <w:t>fullcps0523mincer, fullcps7992mincer, fullcps9304mincer</w:t>
+            </w:r>
+          </w:p>
+        </w:tc>
+        <w:tc>
+          <w:tcPr>
+            <w:tcW w:w="718" w:type="dxa"/>
+          </w:tcPr>
+          <w:p>
+            <w:pPr>
+              <w:rPr>
+                <w:sz w:val="18"/>
+                <w:szCs w:val="18"/>
+              </w:rPr>
+            </w:pPr>
+            <w:r>
+              <w:rPr>
+                <w:sz w:val="18"/>
+                <w:szCs w:val="18"/>
+              </w:rPr>
+              <w:t>Yes</w:t>
+            </w:r>
+          </w:p>
+        </w:tc>
+        <w:tc>
+          <w:tcPr>
+            <w:tcW w:w="1286" w:type="dxa"/>
+          </w:tcPr>
+          <w:p>
+            <w:pPr>
+              <w:rPr>
+                <w:sz w:val="18"/>
+                <w:szCs w:val="18"/>
+              </w:rPr>
+            </w:pPr>
+            <w:r>
+              <w:rPr>
+                <w:sz w:val="18"/>
+                <w:szCs w:val="18"/>
+              </w:rPr>
+              <w:t xml:space="preserve">Runs mincer equation and stores residuals and coefficients </w:t>
+            </w:r>
+            <w:r>
+              <w:rPr>
+                <w:sz w:val="18"/>
+                <w:szCs w:val="18"/>
+              </w:rPr>
+              <w:lastRenderedPageBreak/>
+              <w:t xml:space="preserve">for rolling window and full sample regressions and merges them with the </w:t>
             </w:r>
             <w:proofErr w:type="spellStart"/>
             <w:r>
@@ -2473,133 +2574,15 @@
                 <w:sz w:val="18"/>
                 <w:szCs w:val="18"/>
               </w:rPr>
-              <w:t>employeesgdpmerged</w:t>
+              <w:t>fullcps</w:t>
             </w:r>
             <w:proofErr w:type="spellEnd"/>
-          </w:p>
-        </w:tc>
-        <w:tc>
-          <w:tcPr>
-            <w:tcW w:w="2765" w:type="dxa"/>
-          </w:tcPr>
-          <w:p>
-            <w:pPr>
-              <w:rPr>
-                <w:sz w:val="18"/>
-                <w:szCs w:val="18"/>
-              </w:rPr>
-            </w:pPr>
-            <w:r>
-              <w:rPr>
-                <w:sz w:val="18"/>
-                <w:szCs w:val="18"/>
-              </w:rPr>
-              <w:t xml:space="preserve">separations, </w:t>
-            </w:r>
-            <w:proofErr w:type="spellStart"/>
-            <w:r>
-              <w:rPr>
-                <w:sz w:val="18"/>
-                <w:szCs w:val="18"/>
-              </w:rPr>
-              <w:t>wagechanges</w:t>
-            </w:r>
-            <w:proofErr w:type="spellEnd"/>
-            <w:r>
-              <w:rPr>
-                <w:sz w:val="18"/>
-                <w:szCs w:val="18"/>
-              </w:rPr>
-              <w:t xml:space="preserve">, </w:t>
-            </w:r>
-            <w:proofErr w:type="spellStart"/>
-            <w:r>
-              <w:rPr>
-                <w:sz w:val="18"/>
-                <w:szCs w:val="18"/>
-              </w:rPr>
-              <w:t>collapsed_demographics_i</w:t>
-            </w:r>
-            <w:proofErr w:type="spellEnd"/>
-            <w:r>
-              <w:rPr>
-                <w:sz w:val="18"/>
-                <w:szCs w:val="18"/>
-              </w:rPr>
-              <w:t xml:space="preserve">, </w:t>
-            </w:r>
-            <w:proofErr w:type="spellStart"/>
-            <w:r>
-              <w:rPr>
-                <w:sz w:val="18"/>
-                <w:szCs w:val="18"/>
-              </w:rPr>
-              <w:t>collapsedwages_i</w:t>
-            </w:r>
-            <w:proofErr w:type="spellEnd"/>
-            <w:r>
-              <w:rPr>
-                <w:sz w:val="18"/>
-                <w:szCs w:val="18"/>
-              </w:rPr>
-              <w:t xml:space="preserve">, </w:t>
-            </w:r>
-            <w:proofErr w:type="spellStart"/>
-            <w:r>
-              <w:rPr>
-                <w:sz w:val="18"/>
-                <w:szCs w:val="18"/>
-              </w:rPr>
-              <w:t>collapsedhours_i</w:t>
-            </w:r>
-            <w:proofErr w:type="spellEnd"/>
-          </w:p>
-        </w:tc>
-        <w:tc>
-          <w:tcPr>
-            <w:tcW w:w="718" w:type="dxa"/>
-          </w:tcPr>
-          <w:p>
-            <w:pPr>
-              <w:rPr>
-                <w:sz w:val="18"/>
-                <w:szCs w:val="18"/>
-              </w:rPr>
-            </w:pPr>
-            <w:r>
-              <w:rPr>
-                <w:sz w:val="18"/>
-                <w:szCs w:val="18"/>
-              </w:rPr>
-              <w:t>Yes</w:t>
-            </w:r>
-          </w:p>
-        </w:tc>
-        <w:tc>
-          <w:tcPr>
-            <w:tcW w:w="1286" w:type="dxa"/>
-          </w:tcPr>
-          <w:p>
-            <w:pPr>
-              <w:rPr>
-                <w:sz w:val="18"/>
-                <w:szCs w:val="18"/>
-              </w:rPr>
-            </w:pPr>
-            <w:r>
-              <w:rPr>
-                <w:sz w:val="18"/>
-                <w:szCs w:val="18"/>
-              </w:rPr>
-              <w:t xml:space="preserve">Uses microdata to collapse necessary variables by State, industry, and year-quarter and merges </w:t>
-            </w:r>
-            <w:r>
-              <w:rPr>
-                <w:sz w:val="18"/>
-                <w:szCs w:val="18"/>
-              </w:rPr>
-              <w:lastRenderedPageBreak/>
-              <w:t>with macro data</w:t>
+            <w:r>
+              <w:rPr>
+                <w:sz w:val="18"/>
+                <w:szCs w:val="18"/>
+              </w:rPr>
+              <w:t xml:space="preserve"> files</w:t>
             </w:r>
           </w:p>
         </w:tc>
@@ -2619,61 +2602,19 @@
                 <w:szCs w:val="18"/>
               </w:rPr>
             </w:pPr>
-            <w:proofErr w:type="spellStart"/>
-            <w:r>
-              <w:rPr>
-                <w:sz w:val="18"/>
-                <w:szCs w:val="18"/>
-              </w:rPr>
-              <w:lastRenderedPageBreak/>
-              <w:t>quarterly_logit_</w:t>
-            </w:r>
-            <w:proofErr w:type="gramStart"/>
-            <w:r>
-              <w:rPr>
-                <w:sz w:val="18"/>
-                <w:szCs w:val="18"/>
-              </w:rPr>
-              <w:t>VN</w:t>
-            </w:r>
-            <w:proofErr w:type="spellEnd"/>
-            <w:r>
-              <w:rPr>
-                <w:sz w:val="18"/>
-                <w:szCs w:val="18"/>
-              </w:rPr>
-              <w:t>(</w:t>
-            </w:r>
-            <w:proofErr w:type="gramEnd"/>
-            <w:r>
-              <w:rPr>
-                <w:sz w:val="18"/>
-                <w:szCs w:val="18"/>
-              </w:rPr>
-              <w:t>24)</w:t>
-            </w:r>
-          </w:p>
-        </w:tc>
-        <w:tc>
-          <w:tcPr>
-            <w:tcW w:w="3297" w:type="dxa"/>
-          </w:tcPr>
-          <w:p>
-            <w:pPr>
-              <w:rPr>
-                <w:sz w:val="18"/>
-                <w:szCs w:val="18"/>
-              </w:rPr>
-            </w:pPr>
-            <w:proofErr w:type="spellStart"/>
-            <w:r>
-              <w:rPr>
-                <w:sz w:val="18"/>
-                <w:szCs w:val="18"/>
-              </w:rPr>
-              <w:t>mergedcollapsedcps</w:t>
-            </w:r>
-            <w:proofErr w:type="spellEnd"/>
+          </w:p>
+        </w:tc>
+        <w:tc>
+          <w:tcPr>
+            <w:tcW w:w="3578" w:type="dxa"/>
+          </w:tcPr>
+          <w:p>
+            <w:pPr>
+              <w:rPr>
+                <w:sz w:val="18"/>
+                <w:szCs w:val="18"/>
+              </w:rPr>
+            </w:pPr>
           </w:p>
         </w:tc>
         <w:tc>
@@ -2687,15 +2628,6 @@
                 <w:szCs w:val="18"/>
               </w:rPr>
             </w:pPr>
-            <w:proofErr w:type="spellStart"/>
-            <w:r>
-              <w:rPr>
-                <w:sz w:val="18"/>
-                <w:szCs w:val="18"/>
-              </w:rPr>
-              <w:t>empiricalmodel</w:t>
-            </w:r>
-            <w:proofErr w:type="spellEnd"/>
           </w:p>
         </w:tc>
         <w:tc>
@@ -2709,13 +2641,6 @@
                 <w:szCs w:val="18"/>
               </w:rPr>
             </w:pPr>
-            <w:r>
-              <w:rPr>
-                <w:sz w:val="18"/>
-                <w:szCs w:val="18"/>
-              </w:rPr>
-              <w:t>No</w:t>
-            </w:r>
           </w:p>
         </w:tc>
         <w:tc>
@@ -2729,36 +2654,6 @@
                 <w:szCs w:val="18"/>
               </w:rPr>
             </w:pPr>
-            <w:r>
-              <w:rPr>
-                <w:sz w:val="18"/>
-                <w:szCs w:val="18"/>
-              </w:rPr>
-              <w:t xml:space="preserve">Runs the </w:t>
-            </w:r>
-            <w:proofErr w:type="spellStart"/>
-            <w:r>
-              <w:rPr>
-                <w:sz w:val="18"/>
-                <w:szCs w:val="18"/>
-              </w:rPr>
-              <w:t>xtreg</w:t>
-            </w:r>
-            <w:proofErr w:type="spellEnd"/>
-            <w:r>
-              <w:rPr>
-                <w:sz w:val="18"/>
-                <w:szCs w:val="18"/>
-              </w:rPr>
-              <w:t xml:space="preserve"> regression and creates all the necessary </w:t>
-            </w:r>
-            <w:r>
-              <w:rPr>
-                <w:sz w:val="18"/>
-                <w:szCs w:val="18"/>
-              </w:rPr>
-              <w:t>state-time variables</w:t>
-            </w:r>
           </w:p>
         </w:tc>
       </w:tr>
@@ -2777,58 +2672,19 @@
                 <w:szCs w:val="18"/>
               </w:rPr>
             </w:pPr>
-            <w:proofErr w:type="spellStart"/>
-            <w:r>
-              <w:rPr>
-                <w:sz w:val="18"/>
-                <w:szCs w:val="18"/>
-              </w:rPr>
-              <w:t>MincerEquation_</w:t>
-            </w:r>
-            <w:proofErr w:type="gramStart"/>
-            <w:r>
-              <w:rPr>
-                <w:sz w:val="18"/>
-                <w:szCs w:val="18"/>
-              </w:rPr>
-              <w:t>VN</w:t>
-            </w:r>
-            <w:proofErr w:type="spellEnd"/>
-            <w:r>
-              <w:rPr>
-                <w:sz w:val="18"/>
-                <w:szCs w:val="18"/>
-              </w:rPr>
-              <w:t>(</w:t>
-            </w:r>
-            <w:proofErr w:type="gramEnd"/>
-            <w:r>
-              <w:rPr>
-                <w:sz w:val="18"/>
-                <w:szCs w:val="18"/>
-              </w:rPr>
-              <w:t>24)</w:t>
-            </w:r>
-          </w:p>
-        </w:tc>
-        <w:tc>
-          <w:tcPr>
-            <w:tcW w:w="3297" w:type="dxa"/>
-          </w:tcPr>
-          <w:p>
-            <w:pPr>
-              <w:rPr>
-                <w:sz w:val="18"/>
-                <w:szCs w:val="18"/>
-              </w:rPr>
-            </w:pPr>
-            <w:r>
-              <w:rPr>
-                <w:sz w:val="18"/>
-                <w:szCs w:val="18"/>
-              </w:rPr>
-              <w:t>fullcps0523, fullcps7992, fullcps9304</w:t>
-            </w:r>
+          </w:p>
+        </w:tc>
+        <w:tc>
+          <w:tcPr>
+            <w:tcW w:w="3578" w:type="dxa"/>
+          </w:tcPr>
+          <w:p>
+            <w:pPr>
+              <w:rPr>
+                <w:sz w:val="18"/>
+                <w:szCs w:val="18"/>
+              </w:rPr>
+            </w:pPr>
           </w:p>
         </w:tc>
         <w:tc>
@@ -2842,13 +2698,6 @@
                 <w:szCs w:val="18"/>
               </w:rPr>
             </w:pPr>
-            <w:r>
-              <w:rPr>
-                <w:sz w:val="18"/>
-                <w:szCs w:val="18"/>
-              </w:rPr>
-              <w:t>fullcps0523mincer, fullcps7992mincer, fullcps9304mincer</w:t>
-            </w:r>
           </w:p>
         </w:tc>
         <w:tc>
@@ -2862,13 +2711,6 @@
                 <w:szCs w:val="18"/>
               </w:rPr>
             </w:pPr>
-            <w:r>
-              <w:rPr>
-                <w:sz w:val="18"/>
-                <w:szCs w:val="18"/>
-              </w:rPr>
-              <w:t>Yes</w:t>
-            </w:r>
           </w:p>
         </w:tc>
         <w:tc>
@@ -2882,29 +2724,6 @@
                 <w:szCs w:val="18"/>
               </w:rPr>
             </w:pPr>
-            <w:r>
-              <w:rPr>
-                <w:sz w:val="18"/>
-                <w:szCs w:val="18"/>
-              </w:rPr>
-              <w:t xml:space="preserve">Runs mincer equation and stores residuals and coefficients for rolling window and full sample regressions and merges them with the </w:t>
-            </w:r>
-            <w:proofErr w:type="spellStart"/>
-            <w:r>
-              <w:rPr>
-                <w:sz w:val="18"/>
-                <w:szCs w:val="18"/>
-              </w:rPr>
-              <w:t>fullcps</w:t>
-            </w:r>
-            <w:proofErr w:type="spellEnd"/>
-            <w:r>
-              <w:rPr>
-                <w:sz w:val="18"/>
-                <w:szCs w:val="18"/>
-              </w:rPr>
-              <w:t xml:space="preserve"> files</w:t>
-            </w:r>
           </w:p>
         </w:tc>
       </w:tr>
@@ -2928,7 +2747,7 @@
 </file>
 
 <file path=word/endnotes.xml><?xml version="1.0" encoding="utf-8"?>
-<w:endnotes xmlns:wpc="http://schemas.microsoft.com/office/word/2010/wordprocessingCanvas" xmlns:cx="http://schemas.microsoft.com/office/drawing/2014/chartex" xmlns:cx1="http://schemas.microsoft.com/office/drawing/2015/9/8/chartex" xmlns:cx2="http://schemas.microsoft.com/office/drawing/2015/10/21/chartex" xmlns:cx3="http://schemas.microsoft.com/office/drawing/2016/5/9/chartex" xmlns:cx4="http://schemas.microsoft.com/office/drawing/2016/5/10/chartex" xmlns:cx5="http://schemas.microsoft.com/office/drawing/2016/5/11/chartex" xmlns:cx6="http://schemas.microsoft.com/office/drawing/2016/5/12/chartex" xmlns:cx7="http://schemas.microsoft.com/office/drawing/2016/5/13/chartex" xmlns:cx8="http://schemas.microsoft.com/office/drawing/2016/5/14/chartex" xmlns:mc="http://schemas.openxmlformats.org/markup-compatibility/2006" xmlns:aink="http://schemas.microsoft.com/office/drawing/2016/ink" xmlns:am3d="http://schemas.microsoft.com/office/drawing/2017/model3d" xmlns:o="urn:schemas-microsoft-com:office:office" xmlns:oel="http://schemas.microsoft.com/office/2019/extlst" xmlns:r="http://schemas.openxmlformats.org/officeDocument/2006/relationships" xmlns:m="http://schemas.openxmlformats.org/officeDocument/2006/math" xmlns:v="urn:schemas-microsoft-com:vml" xmlns:wp14="http://schemas.microsoft.com/office/word/2010/wordprocessingDrawing" xmlns:wp="http://schemas.openxmlformats.org/drawingml/2006/wordprocessingDrawing" xmlns:w10="urn:schemas-microsoft-com:office:word" xmlns:w="http://schemas.openxmlformats.org/wordprocessingml/2006/main" xmlns:w14="http://schemas.microsoft.com/office/word/2010/wordml" xmlns:w15="http://schemas.microsoft.com/office/word/2012/wordml" xmlns:w16cex="http://schemas.microsoft.com/office/word/2018/wordml/cex" xmlns:w16cid="http://schemas.microsoft.com/office/word/2016/wordml/cid" xmlns:w16="http://schemas.microsoft.com/office/word/2018/wordml" xmlns:w16du="http://schemas.microsoft.com/office/word/2023/wordml/word16du" xmlns:w16sdtdh="http://schemas.microsoft.com/office/word/2020/wordml/sdtdatahash" xmlns:w16se="http://schemas.microsoft.com/office/word/2015/wordml/symex" xmlns:wpg="http://schemas.microsoft.com/office/word/2010/wordprocessingGroup" xmlns:wpi="http://schemas.microsoft.com/office/word/2010/wordprocessingInk" xmlns:wne="http://schemas.microsoft.com/office/word/2006/wordml" xmlns:wps="http://schemas.microsoft.com/office/word/2010/wordprocessingShape" mc:Ignorable="w14 w15 w16se w16cid w16 w16cex w16sdtdh w16du wp14">
+<w:endnotes xmlns:wpc="http://schemas.microsoft.com/office/word/2010/wordprocessingCanvas" xmlns:cx="http://schemas.microsoft.com/office/drawing/2014/chartex" xmlns:cx1="http://schemas.microsoft.com/office/drawing/2015/9/8/chartex" xmlns:cx2="http://schemas.microsoft.com/office/drawing/2015/10/21/chartex" xmlns:cx3="http://schemas.microsoft.com/office/drawing/2016/5/9/chartex" xmlns:cx4="http://schemas.microsoft.com/office/drawing/2016/5/10/chartex" xmlns:cx5="http://schemas.microsoft.com/office/drawing/2016/5/11/chartex" xmlns:cx6="http://schemas.microsoft.com/office/drawing/2016/5/12/chartex" xmlns:cx7="http://schemas.microsoft.com/office/drawing/2016/5/13/chartex" xmlns:cx8="http://schemas.microsoft.com/office/drawing/2016/5/14/chartex" xmlns:mc="http://schemas.openxmlformats.org/markup-compatibility/2006" xmlns:aink="http://schemas.microsoft.com/office/drawing/2016/ink" xmlns:am3d="http://schemas.microsoft.com/office/drawing/2017/model3d" xmlns:o="urn:schemas-microsoft-com:office:office" xmlns:oel="http://schemas.microsoft.com/office/2019/extlst" xmlns:r="http://schemas.openxmlformats.org/officeDocument/2006/relationships" xmlns:m="http://schemas.openxmlformats.org/officeDocument/2006/math" xmlns:v="urn:schemas-microsoft-com:vml" xmlns:wp14="http://schemas.microsoft.com/office/word/2010/wordprocessingDrawing" xmlns:wp="http://schemas.openxmlformats.org/drawingml/2006/wordprocessingDrawing" xmlns:w10="urn:schemas-microsoft-com:office:word" xmlns:w="http://schemas.openxmlformats.org/wordprocessingml/2006/main" xmlns:w14="http://schemas.microsoft.com/office/word/2010/wordml" xmlns:w15="http://schemas.microsoft.com/office/word/2012/wordml" xmlns:w16cex="http://schemas.microsoft.com/office/word/2018/wordml/cex" xmlns:w16cid="http://schemas.microsoft.com/office/word/2016/wordml/cid" xmlns:w16="http://schemas.microsoft.com/office/word/2018/wordml" xmlns:w16du="http://schemas.microsoft.com/office/word/2023/wordml/word16du" xmlns:w16sdtdh="http://schemas.microsoft.com/office/word/2020/wordml/sdtdatahash" xmlns:w16sdtfl="http://schemas.microsoft.com/office/word/2024/wordml/sdtformatlock" xmlns:w16se="http://schemas.microsoft.com/office/word/2015/wordml/symex" xmlns:wpg="http://schemas.microsoft.com/office/word/2010/wordprocessingGroup" xmlns:wpi="http://schemas.microsoft.com/office/word/2010/wordprocessingInk" xmlns:wne="http://schemas.microsoft.com/office/word/2006/wordml" xmlns:wps="http://schemas.microsoft.com/office/word/2010/wordprocessingShape" mc:Ignorable="w14 w15 w16se w16cid w16 w16cex w16sdtdh w16sdtfl w16du wp14">
   <w:endnote w:type="separator" w:id="-1">
     <w:p>
       <w:r>
@@ -2947,7 +2766,7 @@
 </file>
 
 <file path=word/footnotes.xml><?xml version="1.0" encoding="utf-8"?>
-<w:footnotes xmlns:wpc="http://schemas.microsoft.com/office/word/2010/wordprocessingCanvas" xmlns:cx="http://schemas.microsoft.com/office/drawing/2014/chartex" xmlns:cx1="http://schemas.microsoft.com/office/drawing/2015/9/8/chartex" xmlns:cx2="http://schemas.microsoft.com/office/drawing/2015/10/21/chartex" xmlns:cx3="http://schemas.microsoft.com/office/drawing/2016/5/9/chartex" xmlns:cx4="http://schemas.microsoft.com/office/drawing/2016/5/10/chartex" xmlns:cx5="http://schemas.microsoft.com/office/drawing/2016/5/11/chartex" xmlns:cx6="http://schemas.microsoft.com/office/drawing/2016/5/12/chartex" xmlns:cx7="http://schemas.microsoft.com/office/drawing/2016/5/13/chartex" xmlns:cx8="http://schemas.microsoft.com/office/drawing/2016/5/14/chartex" xmlns:mc="http://schemas.openxmlformats.org/markup-compatibility/2006" xmlns:aink="http://schemas.microsoft.com/office/drawing/2016/ink" xmlns:am3d="http://schemas.microsoft.com/office/drawing/2017/model3d" xmlns:o="urn:schemas-microsoft-com:office:office" xmlns:oel="http://schemas.microsoft.com/office/2019/extlst" xmlns:r="http://schemas.openxmlformats.org/officeDocument/2006/relationships" xmlns:m="http://schemas.openxmlformats.org/officeDocument/2006/math" xmlns:v="urn:schemas-microsoft-com:vml" xmlns:wp14="http://schemas.microsoft.com/office/word/2010/wordprocessingDrawing" xmlns:wp="http://schemas.openxmlformats.org/drawingml/2006/wordprocessingDrawing" xmlns:w10="urn:schemas-microsoft-com:office:word" xmlns:w="http://schemas.openxmlformats.org/wordprocessingml/2006/main" xmlns:w14="http://schemas.microsoft.com/office/word/2010/wordml" xmlns:w15="http://schemas.microsoft.com/office/word/2012/wordml" xmlns:w16cex="http://schemas.microsoft.com/office/word/2018/wordml/cex" xmlns:w16cid="http://schemas.microsoft.com/office/word/2016/wordml/cid" xmlns:w16="http://schemas.microsoft.com/office/word/2018/wordml" xmlns:w16du="http://schemas.microsoft.com/office/word/2023/wordml/word16du" xmlns:w16sdtdh="http://schemas.microsoft.com/office/word/2020/wordml/sdtdatahash" xmlns:w16se="http://schemas.microsoft.com/office/word/2015/wordml/symex" xmlns:wpg="http://schemas.microsoft.com/office/word/2010/wordprocessingGroup" xmlns:wpi="http://schemas.microsoft.com/office/word/2010/wordprocessingInk" xmlns:wne="http://schemas.microsoft.com/office/word/2006/wordml" xmlns:wps="http://schemas.microsoft.com/office/word/2010/wordprocessingShape" mc:Ignorable="w14 w15 w16se w16cid w16 w16cex w16sdtdh w16du wp14">
+<w:footnotes xmlns:wpc="http://schemas.microsoft.com/office/word/2010/wordprocessingCanvas" xmlns:cx="http://schemas.microsoft.com/office/drawing/2014/chartex" xmlns:cx1="http://schemas.microsoft.com/office/drawing/2015/9/8/chartex" xmlns:cx2="http://schemas.microsoft.com/office/drawing/2015/10/21/chartex" xmlns:cx3="http://schemas.microsoft.com/office/drawing/2016/5/9/chartex" xmlns:cx4="http://schemas.microsoft.com/office/drawing/2016/5/10/chartex" xmlns:cx5="http://schemas.microsoft.com/office/drawing/2016/5/11/chartex" xmlns:cx6="http://schemas.microsoft.com/office/drawing/2016/5/12/chartex" xmlns:cx7="http://schemas.microsoft.com/office/drawing/2016/5/13/chartex" xmlns:cx8="http://schemas.microsoft.com/office/drawing/2016/5/14/chartex" xmlns:mc="http://schemas.openxmlformats.org/markup-compatibility/2006" xmlns:aink="http://schemas.microsoft.com/office/drawing/2016/ink" xmlns:am3d="http://schemas.microsoft.com/office/drawing/2017/model3d" xmlns:o="urn:schemas-microsoft-com:office:office" xmlns:oel="http://schemas.microsoft.com/office/2019/extlst" xmlns:r="http://schemas.openxmlformats.org/officeDocument/2006/relationships" xmlns:m="http://schemas.openxmlformats.org/officeDocument/2006/math" xmlns:v="urn:schemas-microsoft-com:vml" xmlns:wp14="http://schemas.microsoft.com/office/word/2010/wordprocessingDrawing" xmlns:wp="http://schemas.openxmlformats.org/drawingml/2006/wordprocessingDrawing" xmlns:w10="urn:schemas-microsoft-com:office:word" xmlns:w="http://schemas.openxmlformats.org/wordprocessingml/2006/main" xmlns:w14="http://schemas.microsoft.com/office/word/2010/wordml" xmlns:w15="http://schemas.microsoft.com/office/word/2012/wordml" xmlns:w16cex="http://schemas.microsoft.com/office/word/2018/wordml/cex" xmlns:w16cid="http://schemas.microsoft.com/office/word/2016/wordml/cid" xmlns:w16="http://schemas.microsoft.com/office/word/2018/wordml" xmlns:w16du="http://schemas.microsoft.com/office/word/2023/wordml/word16du" xmlns:w16sdtdh="http://schemas.microsoft.com/office/word/2020/wordml/sdtdatahash" xmlns:w16sdtfl="http://schemas.microsoft.com/office/word/2024/wordml/sdtformatlock" xmlns:w16se="http://schemas.microsoft.com/office/word/2015/wordml/symex" xmlns:wpg="http://schemas.microsoft.com/office/word/2010/wordprocessingGroup" xmlns:wpi="http://schemas.microsoft.com/office/word/2010/wordprocessingInk" xmlns:wne="http://schemas.microsoft.com/office/word/2006/wordml" xmlns:wps="http://schemas.microsoft.com/office/word/2010/wordprocessingShape" mc:Ignorable="w14 w15 w16se w16cid w16 w16cex w16sdtdh w16sdtfl w16du wp14">
   <w:footnote w:type="separator" w:id="-1">
     <w:p>
       <w:r>
@@ -2966,7 +2785,7 @@
 </file>
 
 <file path=word/styles.xml><?xml version="1.0" encoding="utf-8"?>
-<w:styles xmlns:mc="http://schemas.openxmlformats.org/markup-compatibility/2006" xmlns:r="http://schemas.openxmlformats.org/officeDocument/2006/relationships" xmlns:w="http://schemas.openxmlformats.org/wordprocessingml/2006/main" xmlns:w14="http://schemas.microsoft.com/office/word/2010/wordml" xmlns:w15="http://schemas.microsoft.com/office/word/2012/wordml" xmlns:w16cex="http://schemas.microsoft.com/office/word/2018/wordml/cex" xmlns:w16cid="http://schemas.microsoft.com/office/word/2016/wordml/cid" xmlns:w16="http://schemas.microsoft.com/office/word/2018/wordml" xmlns:w16du="http://schemas.microsoft.com/office/word/2023/wordml/word16du" xmlns:w16sdtdh="http://schemas.microsoft.com/office/word/2020/wordml/sdtdatahash" xmlns:w16se="http://schemas.microsoft.com/office/word/2015/wordml/symex" mc:Ignorable="w14 w15 w16se w16cid w16 w16cex w16sdtdh w16du">
+<w:styles xmlns:mc="http://schemas.openxmlformats.org/markup-compatibility/2006" xmlns:r="http://schemas.openxmlformats.org/officeDocument/2006/relationships" xmlns:w="http://schemas.openxmlformats.org/wordprocessingml/2006/main" xmlns:w14="http://schemas.microsoft.com/office/word/2010/wordml" xmlns:w15="http://schemas.microsoft.com/office/word/2012/wordml" xmlns:w16cex="http://schemas.microsoft.com/office/word/2018/wordml/cex" xmlns:w16cid="http://schemas.microsoft.com/office/word/2016/wordml/cid" xmlns:w16="http://schemas.microsoft.com/office/word/2018/wordml" xmlns:w16du="http://schemas.microsoft.com/office/word/2023/wordml/word16du" xmlns:w16sdtdh="http://schemas.microsoft.com/office/word/2020/wordml/sdtdatahash" xmlns:w16sdtfl="http://schemas.microsoft.com/office/word/2024/wordml/sdtformatlock" xmlns:w16se="http://schemas.microsoft.com/office/word/2015/wordml/symex" mc:Ignorable="w14 w15 w16se w16cid w16 w16cex w16sdtdh w16sdtfl w16du">
   <w:docDefaults>
     <w:rPrDefault>
       <w:rPr>

</xml_diff>